<commit_message>
lab6: Finished exercise 1
</commit_message>
<xml_diff>
--- a/lab6/lab6_report.docx
+++ b/lab6/lab6_report.docx
@@ -57,62 +57,7 @@
           <w:lang w:val="en-GB" w:eastAsia="nb-NO"/>
           <w14:ligatures w14:val="none"/>
         </w:rPr>
-        <w:t xml:space="preserve">Report for Lab </w:t>
-      </w:r>
-      <w:r>
-        <w:rPr>
-          <w:rFonts w:ascii="Times New Roman" w:eastAsiaTheme="majorEastAsia" w:hAnsi="Times New Roman" w:cs="Times New Roman"/>
-          <w:kern w:val="0"/>
-          <w:sz w:val="32"/>
-          <w:szCs w:val="32"/>
-          <w:lang w:val="en-GB" w:eastAsia="nb-NO"/>
-          <w14:ligatures w14:val="none"/>
-        </w:rPr>
-        <w:t>6</w:t>
-      </w:r>
-      <w:r>
-        <w:rPr>
-          <w:rFonts w:ascii="Times New Roman" w:eastAsiaTheme="majorEastAsia" w:hAnsi="Times New Roman" w:cs="Times New Roman"/>
-          <w:kern w:val="0"/>
-          <w:sz w:val="32"/>
-          <w:szCs w:val="32"/>
-          <w:lang w:val="en-GB" w:eastAsia="nb-NO"/>
-          <w14:ligatures w14:val="none"/>
-        </w:rPr>
-        <w:t xml:space="preserve">: </w:t>
-      </w:r>
-      <w:r>
-        <w:rPr>
-          <w:rFonts w:ascii="Times New Roman" w:eastAsiaTheme="majorEastAsia" w:hAnsi="Times New Roman" w:cs="Times New Roman"/>
-          <w:kern w:val="0"/>
-          <w:sz w:val="32"/>
-          <w:szCs w:val="32"/>
-          <w:lang w:val="en-GB" w:eastAsia="nb-NO"/>
-          <w14:ligatures w14:val="none"/>
-        </w:rPr>
-        <w:t xml:space="preserve">Thread </w:t>
-      </w:r>
-      <w:r>
-        <w:rPr>
-          <w:rFonts w:ascii="Times New Roman" w:eastAsiaTheme="majorEastAsia" w:hAnsi="Times New Roman" w:cs="Times New Roman"/>
-          <w:kern w:val="0"/>
-          <w:sz w:val="32"/>
-          <w:szCs w:val="32"/>
-          <w:lang w:val="en-GB" w:eastAsia="nb-NO"/>
-          <w14:ligatures w14:val="none"/>
-        </w:rPr>
-        <w:t xml:space="preserve">Synchronization </w:t>
-      </w:r>
-      <w:r>
-        <w:rPr>
-          <w:rFonts w:ascii="Times New Roman" w:eastAsiaTheme="majorEastAsia" w:hAnsi="Times New Roman" w:cs="Times New Roman"/>
-          <w:kern w:val="0"/>
-          <w:sz w:val="32"/>
-          <w:szCs w:val="32"/>
-          <w:lang w:val="en-GB" w:eastAsia="nb-NO"/>
-          <w14:ligatures w14:val="none"/>
-        </w:rPr>
-        <w:t>1</w:t>
+        <w:t>Report for Lab 6: Thread Synchronization 1</w:t>
       </w:r>
     </w:p>
     <w:p>
@@ -244,6 +189,156 @@
         <w:rPr>
           <w:rFonts w:ascii="Times New Roman" w:eastAsiaTheme="majorEastAsia" w:hAnsi="Times New Roman" w:cs="Times New Roman"/>
           <w:kern w:val="0"/>
+          <w:sz w:val="28"/>
+          <w:szCs w:val="28"/>
+          <w:u w:val="single"/>
+          <w:lang w:val="en-GB" w:eastAsia="nb-NO"/>
+          <w14:ligatures w14:val="none"/>
+        </w:rPr>
+      </w:pPr>
+      <w:r>
+        <w:rPr>
+          <w:rFonts w:ascii="Times New Roman" w:eastAsiaTheme="majorEastAsia" w:hAnsi="Times New Roman" w:cs="Times New Roman"/>
+          <w:kern w:val="0"/>
+          <w:sz w:val="28"/>
+          <w:szCs w:val="28"/>
+          <w:u w:val="single"/>
+          <w:lang w:val="en-GB" w:eastAsia="nb-NO"/>
+          <w14:ligatures w14:val="none"/>
+        </w:rPr>
+        <w:t>Subtask 1: Run the code</w:t>
+      </w:r>
+      <w:r>
+        <w:rPr>
+          <w:rFonts w:ascii="Times New Roman" w:eastAsiaTheme="majorEastAsia" w:hAnsi="Times New Roman" w:cs="Times New Roman"/>
+          <w:kern w:val="0"/>
+          <w:sz w:val="28"/>
+          <w:szCs w:val="28"/>
+          <w:u w:val="single"/>
+          <w:lang w:val="en-GB" w:eastAsia="nb-NO"/>
+          <w14:ligatures w14:val="none"/>
+        </w:rPr>
+        <w:t xml:space="preserve"> several times</w:t>
+      </w:r>
+      <w:r>
+        <w:rPr>
+          <w:rFonts w:ascii="Times New Roman" w:eastAsiaTheme="majorEastAsia" w:hAnsi="Times New Roman" w:cs="Times New Roman"/>
+          <w:kern w:val="0"/>
+          <w:sz w:val="28"/>
+          <w:szCs w:val="28"/>
+          <w:u w:val="single"/>
+          <w:lang w:val="en-GB" w:eastAsia="nb-NO"/>
+          <w14:ligatures w14:val="none"/>
+        </w:rPr>
+        <w:t xml:space="preserve"> and include the output</w:t>
+      </w:r>
+    </w:p>
+    <w:p>
+      <w:pPr>
+        <w:pStyle w:val="Listeavsnitt"/>
+        <w:keepNext/>
+        <w:keepLines/>
+        <w:numPr>
+          <w:ilvl w:val="1"/>
+          <w:numId w:val="14"/>
+        </w:numPr>
+        <w:spacing w:before="360" w:after="120" w:line="360" w:lineRule="auto"/>
+        <w:ind w:right="360"/>
+        <w:outlineLvl w:val="0"/>
+        <w:rPr>
+          <w:rFonts w:ascii="Times New Roman" w:eastAsiaTheme="majorEastAsia" w:hAnsi="Times New Roman" w:cs="Times New Roman"/>
+          <w:i/>
+          <w:iCs/>
+          <w:kern w:val="0"/>
+          <w:lang w:val="en-GB" w:eastAsia="nb-NO"/>
+          <w14:ligatures w14:val="none"/>
+        </w:rPr>
+      </w:pPr>
+      <w:r>
+        <w:rPr>
+          <w:rFonts w:ascii="Times New Roman" w:eastAsiaTheme="majorEastAsia" w:hAnsi="Times New Roman" w:cs="Times New Roman"/>
+          <w:kern w:val="0"/>
+          <w:lang w:val="en-GB" w:eastAsia="nb-NO"/>
+          <w14:ligatures w14:val="none"/>
+        </w:rPr>
+        <w:drawing>
+          <wp:anchor distT="0" distB="0" distL="114300" distR="114300" simplePos="0" relativeHeight="251660288" behindDoc="0" locked="0" layoutInCell="1" allowOverlap="1" wp14:anchorId="35C63559" wp14:editId="7C3EC120">
+            <wp:simplePos x="0" y="0"/>
+            <wp:positionH relativeFrom="column">
+              <wp:posOffset>-464487</wp:posOffset>
+            </wp:positionH>
+            <wp:positionV relativeFrom="paragraph">
+              <wp:posOffset>3298627</wp:posOffset>
+            </wp:positionV>
+            <wp:extent cx="3207385" cy="3181794"/>
+            <wp:effectExtent l="0" t="0" r="5715" b="6350"/>
+            <wp:wrapSquare wrapText="bothSides"/>
+            <wp:docPr id="1402545808" name="Bilde 1" descr="Et bilde som inneholder tekst, skjermbilde&#10;&#10;KI-generert innhold kan være feil."/>
+            <wp:cNvGraphicFramePr>
+              <a:graphicFrameLocks xmlns:a="http://schemas.openxmlformats.org/drawingml/2006/main" noChangeAspect="1"/>
+            </wp:cNvGraphicFramePr>
+            <a:graphic xmlns:a="http://schemas.openxmlformats.org/drawingml/2006/main">
+              <a:graphicData uri="http://schemas.openxmlformats.org/drawingml/2006/picture">
+                <pic:pic xmlns:pic="http://schemas.openxmlformats.org/drawingml/2006/picture">
+                  <pic:nvPicPr>
+                    <pic:cNvPr id="1402545808" name="Bilde 1" descr="Et bilde som inneholder tekst, skjermbilde&#10;&#10;KI-generert innhold kan være feil."/>
+                    <pic:cNvPicPr/>
+                  </pic:nvPicPr>
+                  <pic:blipFill>
+                    <a:blip r:embed="rId5">
+                      <a:extLst>
+                        <a:ext uri="{28A0092B-C50C-407E-A947-70E740481C1C}">
+                          <a14:useLocalDpi xmlns:a14="http://schemas.microsoft.com/office/drawing/2010/main" val="0"/>
+                        </a:ext>
+                      </a:extLst>
+                    </a:blip>
+                    <a:stretch>
+                      <a:fillRect/>
+                    </a:stretch>
+                  </pic:blipFill>
+                  <pic:spPr>
+                    <a:xfrm>
+                      <a:off x="0" y="0"/>
+                      <a:ext cx="3207385" cy="3181794"/>
+                    </a:xfrm>
+                    <a:prstGeom prst="rect">
+                      <a:avLst/>
+                    </a:prstGeom>
+                  </pic:spPr>
+                </pic:pic>
+              </a:graphicData>
+            </a:graphic>
+            <wp14:sizeRelH relativeFrom="page">
+              <wp14:pctWidth>0</wp14:pctWidth>
+            </wp14:sizeRelH>
+            <wp14:sizeRelV relativeFrom="page">
+              <wp14:pctHeight>0</wp14:pctHeight>
+            </wp14:sizeRelV>
+          </wp:anchor>
+        </w:drawing>
+      </w:r>
+      <w:r>
+        <w:rPr>
+          <w:rFonts w:ascii="Times New Roman" w:eastAsiaTheme="majorEastAsia" w:hAnsi="Times New Roman" w:cs="Times New Roman"/>
+          <w:i/>
+          <w:iCs/>
+          <w:kern w:val="0"/>
+          <w:lang w:val="en-GB" w:eastAsia="nb-NO"/>
+          <w14:ligatures w14:val="none"/>
+        </w:rPr>
+        <w:t>Attached 3 screenshots:</w:t>
+      </w:r>
+    </w:p>
+    <w:p>
+      <w:pPr>
+        <w:keepNext/>
+        <w:keepLines/>
+        <w:spacing w:before="360" w:after="120" w:line="360" w:lineRule="auto"/>
+        <w:ind w:left="720" w:right="360"/>
+        <w:outlineLvl w:val="0"/>
+        <w:rPr>
+          <w:rFonts w:ascii="Times New Roman" w:eastAsiaTheme="majorEastAsia" w:hAnsi="Times New Roman" w:cs="Times New Roman"/>
+          <w:kern w:val="0"/>
           <w:sz w:val="32"/>
           <w:szCs w:val="32"/>
           <w:lang w:val="en-GB" w:eastAsia="nb-NO"/>
@@ -259,7 +354,166 @@
           <w:lang w:val="en-GB" w:eastAsia="nb-NO"/>
           <w14:ligatures w14:val="none"/>
         </w:rPr>
-        <w:t>Subtask 1: Run the code and include the output</w:t>
+        <w:drawing>
+          <wp:anchor distT="0" distB="0" distL="114300" distR="114300" simplePos="0" relativeHeight="251658240" behindDoc="0" locked="0" layoutInCell="1" allowOverlap="1" wp14:anchorId="29BDA7FF" wp14:editId="43FA05E2">
+            <wp:simplePos x="0" y="0"/>
+            <wp:positionH relativeFrom="column">
+              <wp:posOffset>-465455</wp:posOffset>
+            </wp:positionH>
+            <wp:positionV relativeFrom="paragraph">
+              <wp:posOffset>158115</wp:posOffset>
+            </wp:positionV>
+            <wp:extent cx="3147695" cy="2566035"/>
+            <wp:effectExtent l="0" t="0" r="1905" b="0"/>
+            <wp:wrapSquare wrapText="bothSides"/>
+            <wp:docPr id="218399914" name="Bilde 1" descr="Et bilde som inneholder tekst, skjermbilde, programvare&#10;&#10;KI-generert innhold kan være feil."/>
+            <wp:cNvGraphicFramePr>
+              <a:graphicFrameLocks xmlns:a="http://schemas.openxmlformats.org/drawingml/2006/main" noChangeAspect="1"/>
+            </wp:cNvGraphicFramePr>
+            <a:graphic xmlns:a="http://schemas.openxmlformats.org/drawingml/2006/main">
+              <a:graphicData uri="http://schemas.openxmlformats.org/drawingml/2006/picture">
+                <pic:pic xmlns:pic="http://schemas.openxmlformats.org/drawingml/2006/picture">
+                  <pic:nvPicPr>
+                    <pic:cNvPr id="218399914" name="Bilde 1" descr="Et bilde som inneholder tekst, skjermbilde, programvare&#10;&#10;KI-generert innhold kan være feil."/>
+                    <pic:cNvPicPr/>
+                  </pic:nvPicPr>
+                  <pic:blipFill>
+                    <a:blip r:embed="rId6" cstate="print">
+                      <a:extLst>
+                        <a:ext uri="{28A0092B-C50C-407E-A947-70E740481C1C}">
+                          <a14:useLocalDpi xmlns:a14="http://schemas.microsoft.com/office/drawing/2010/main" val="0"/>
+                        </a:ext>
+                      </a:extLst>
+                    </a:blip>
+                    <a:stretch>
+                      <a:fillRect/>
+                    </a:stretch>
+                  </pic:blipFill>
+                  <pic:spPr>
+                    <a:xfrm>
+                      <a:off x="0" y="0"/>
+                      <a:ext cx="3147695" cy="2566035"/>
+                    </a:xfrm>
+                    <a:prstGeom prst="rect">
+                      <a:avLst/>
+                    </a:prstGeom>
+                  </pic:spPr>
+                </pic:pic>
+              </a:graphicData>
+            </a:graphic>
+            <wp14:sizeRelH relativeFrom="page">
+              <wp14:pctWidth>0</wp14:pctWidth>
+            </wp14:sizeRelH>
+            <wp14:sizeRelV relativeFrom="page">
+              <wp14:pctHeight>0</wp14:pctHeight>
+            </wp14:sizeRelV>
+          </wp:anchor>
+        </w:drawing>
+      </w:r>
+    </w:p>
+    <w:p>
+      <w:pPr>
+        <w:keepNext/>
+        <w:keepLines/>
+        <w:spacing w:before="360" w:after="120" w:line="360" w:lineRule="auto"/>
+        <w:ind w:left="720" w:right="360"/>
+        <w:outlineLvl w:val="0"/>
+        <w:rPr>
+          <w:rFonts w:ascii="Times New Roman" w:eastAsiaTheme="majorEastAsia" w:hAnsi="Times New Roman" w:cs="Times New Roman"/>
+          <w:kern w:val="0"/>
+          <w:sz w:val="32"/>
+          <w:szCs w:val="32"/>
+          <w:lang w:val="en-GB" w:eastAsia="nb-NO"/>
+          <w14:ligatures w14:val="none"/>
+        </w:rPr>
+      </w:pPr>
+      <w:r>
+        <w:rPr>
+          <w:rFonts w:ascii="Times New Roman" w:eastAsiaTheme="majorEastAsia" w:hAnsi="Times New Roman" w:cs="Times New Roman"/>
+          <w:kern w:val="0"/>
+          <w:sz w:val="32"/>
+          <w:szCs w:val="32"/>
+          <w:lang w:val="en-GB" w:eastAsia="nb-NO"/>
+          <w14:ligatures w14:val="none"/>
+        </w:rPr>
+        <w:drawing>
+          <wp:anchor distT="0" distB="0" distL="114300" distR="114300" simplePos="0" relativeHeight="251659264" behindDoc="0" locked="0" layoutInCell="1" allowOverlap="1" wp14:anchorId="18F9AE55" wp14:editId="06C44DC9">
+            <wp:simplePos x="0" y="0"/>
+            <wp:positionH relativeFrom="column">
+              <wp:posOffset>2922270</wp:posOffset>
+            </wp:positionH>
+            <wp:positionV relativeFrom="paragraph">
+              <wp:posOffset>808188</wp:posOffset>
+            </wp:positionV>
+            <wp:extent cx="3207895" cy="3132316"/>
+            <wp:effectExtent l="0" t="0" r="5715" b="5080"/>
+            <wp:wrapSquare wrapText="bothSides"/>
+            <wp:docPr id="181376718" name="Bilde 1" descr="Et bilde som inneholder tekst, skjermbilde, programvare&#10;&#10;KI-generert innhold kan være feil."/>
+            <wp:cNvGraphicFramePr>
+              <a:graphicFrameLocks xmlns:a="http://schemas.openxmlformats.org/drawingml/2006/main" noChangeAspect="1"/>
+            </wp:cNvGraphicFramePr>
+            <a:graphic xmlns:a="http://schemas.openxmlformats.org/drawingml/2006/main">
+              <a:graphicData uri="http://schemas.openxmlformats.org/drawingml/2006/picture">
+                <pic:pic xmlns:pic="http://schemas.openxmlformats.org/drawingml/2006/picture">
+                  <pic:nvPicPr>
+                    <pic:cNvPr id="181376718" name="Bilde 1" descr="Et bilde som inneholder tekst, skjermbilde, programvare&#10;&#10;KI-generert innhold kan være feil."/>
+                    <pic:cNvPicPr/>
+                  </pic:nvPicPr>
+                  <pic:blipFill>
+                    <a:blip r:embed="rId7">
+                      <a:extLst>
+                        <a:ext uri="{28A0092B-C50C-407E-A947-70E740481C1C}">
+                          <a14:useLocalDpi xmlns:a14="http://schemas.microsoft.com/office/drawing/2010/main" val="0"/>
+                        </a:ext>
+                      </a:extLst>
+                    </a:blip>
+                    <a:stretch>
+                      <a:fillRect/>
+                    </a:stretch>
+                  </pic:blipFill>
+                  <pic:spPr>
+                    <a:xfrm>
+                      <a:off x="0" y="0"/>
+                      <a:ext cx="3207895" cy="3132316"/>
+                    </a:xfrm>
+                    <a:prstGeom prst="rect">
+                      <a:avLst/>
+                    </a:prstGeom>
+                  </pic:spPr>
+                </pic:pic>
+              </a:graphicData>
+            </a:graphic>
+            <wp14:sizeRelH relativeFrom="page">
+              <wp14:pctWidth>0</wp14:pctWidth>
+            </wp14:sizeRelH>
+            <wp14:sizeRelV relativeFrom="page">
+              <wp14:pctHeight>0</wp14:pctHeight>
+            </wp14:sizeRelV>
+          </wp:anchor>
+        </w:drawing>
+      </w:r>
+    </w:p>
+    <w:p>
+      <w:pPr>
+        <w:rPr>
+          <w:rFonts w:ascii="Times New Roman" w:eastAsiaTheme="majorEastAsia" w:hAnsi="Times New Roman" w:cs="Times New Roman"/>
+          <w:kern w:val="0"/>
+          <w:sz w:val="32"/>
+          <w:szCs w:val="32"/>
+          <w:lang w:val="en-GB" w:eastAsia="nb-NO"/>
+          <w14:ligatures w14:val="none"/>
+        </w:rPr>
+      </w:pPr>
+      <w:r>
+        <w:rPr>
+          <w:rFonts w:ascii="Times New Roman" w:eastAsiaTheme="majorEastAsia" w:hAnsi="Times New Roman" w:cs="Times New Roman"/>
+          <w:kern w:val="0"/>
+          <w:sz w:val="32"/>
+          <w:szCs w:val="32"/>
+          <w:lang w:val="en-GB" w:eastAsia="nb-NO"/>
+          <w14:ligatures w14:val="none"/>
+        </w:rPr>
+        <w:br w:type="page"/>
       </w:r>
     </w:p>
     <w:p>
@@ -277,22 +531,63 @@
         <w:rPr>
           <w:rFonts w:ascii="Times New Roman" w:eastAsiaTheme="majorEastAsia" w:hAnsi="Times New Roman" w:cs="Times New Roman"/>
           <w:kern w:val="0"/>
-          <w:sz w:val="32"/>
-          <w:szCs w:val="32"/>
-          <w:lang w:val="en-GB" w:eastAsia="nb-NO"/>
-          <w14:ligatures w14:val="none"/>
-        </w:rPr>
-      </w:pPr>
-      <w:r>
-        <w:rPr>
-          <w:rFonts w:ascii="Times New Roman" w:eastAsiaTheme="majorEastAsia" w:hAnsi="Times New Roman" w:cs="Times New Roman"/>
-          <w:kern w:val="0"/>
-          <w:sz w:val="32"/>
-          <w:szCs w:val="32"/>
-          <w:lang w:val="en-GB" w:eastAsia="nb-NO"/>
-          <w14:ligatures w14:val="none"/>
-        </w:rPr>
+          <w:sz w:val="28"/>
+          <w:szCs w:val="28"/>
+          <w:u w:val="single"/>
+          <w:lang w:val="en-GB" w:eastAsia="nb-NO"/>
+          <w14:ligatures w14:val="none"/>
+        </w:rPr>
+      </w:pPr>
+      <w:r>
+        <w:rPr>
+          <w:rFonts w:ascii="Times New Roman" w:eastAsiaTheme="majorEastAsia" w:hAnsi="Times New Roman" w:cs="Times New Roman"/>
+          <w:kern w:val="0"/>
+          <w:sz w:val="28"/>
+          <w:szCs w:val="28"/>
+          <w:u w:val="single"/>
+          <w:lang w:val="en-GB" w:eastAsia="nb-NO"/>
+          <w14:ligatures w14:val="none"/>
+        </w:rPr>
+        <w:lastRenderedPageBreak/>
         <w:t>Subtask 2: Do you get the same output from all runs?</w:t>
+      </w:r>
+    </w:p>
+    <w:p>
+      <w:pPr>
+        <w:pStyle w:val="Listeavsnitt"/>
+        <w:keepNext/>
+        <w:keepLines/>
+        <w:numPr>
+          <w:ilvl w:val="1"/>
+          <w:numId w:val="14"/>
+        </w:numPr>
+        <w:spacing w:before="360" w:after="120" w:line="360" w:lineRule="auto"/>
+        <w:ind w:right="360"/>
+        <w:outlineLvl w:val="0"/>
+        <w:rPr>
+          <w:rFonts w:ascii="Times New Roman" w:eastAsiaTheme="majorEastAsia" w:hAnsi="Times New Roman" w:cs="Times New Roman"/>
+          <w:kern w:val="0"/>
+          <w:lang w:val="en-GB" w:eastAsia="nb-NO"/>
+          <w14:ligatures w14:val="none"/>
+        </w:rPr>
+      </w:pPr>
+      <w:r>
+        <w:rPr>
+          <w:rFonts w:ascii="Times New Roman" w:eastAsiaTheme="majorEastAsia" w:hAnsi="Times New Roman" w:cs="Times New Roman"/>
+          <w:kern w:val="0"/>
+          <w:lang w:val="en-GB" w:eastAsia="nb-NO"/>
+          <w14:ligatures w14:val="none"/>
+        </w:rPr>
+        <w:t>No, I do not get the same output each time.</w:t>
+      </w:r>
+      <w:r>
+        <w:rPr>
+          <w:rFonts w:ascii="Times New Roman" w:eastAsiaTheme="majorEastAsia" w:hAnsi="Times New Roman" w:cs="Times New Roman"/>
+          <w:kern w:val="0"/>
+          <w:lang w:val="en-GB" w:eastAsia="nb-NO"/>
+          <w14:ligatures w14:val="none"/>
+        </w:rPr>
+        <w:t xml:space="preserve"> The key difference is the execution order varies between runs. This demonstrates non-deterministic behaviour due to threads not being synchronized.</w:t>
       </w:r>
     </w:p>
     <w:p>
@@ -310,33 +605,173 @@
         <w:rPr>
           <w:rFonts w:ascii="Times New Roman" w:eastAsiaTheme="majorEastAsia" w:hAnsi="Times New Roman" w:cs="Times New Roman"/>
           <w:kern w:val="0"/>
-          <w:sz w:val="32"/>
-          <w:szCs w:val="32"/>
-          <w:lang w:val="en-GB" w:eastAsia="nb-NO"/>
-          <w14:ligatures w14:val="none"/>
-        </w:rPr>
-      </w:pPr>
-      <w:r>
-        <w:rPr>
-          <w:rFonts w:ascii="Times New Roman" w:eastAsiaTheme="majorEastAsia" w:hAnsi="Times New Roman" w:cs="Times New Roman"/>
-          <w:kern w:val="0"/>
-          <w:sz w:val="32"/>
-          <w:szCs w:val="32"/>
-          <w:lang w:val="en-GB" w:eastAsia="nb-NO"/>
-          <w14:ligatures w14:val="none"/>
-        </w:rPr>
-        <w:t xml:space="preserve">Subtask 3: </w:t>
-      </w:r>
-      <w:r>
-        <w:rPr>
-          <w:rFonts w:ascii="Times New Roman" w:eastAsiaTheme="majorEastAsia" w:hAnsi="Times New Roman" w:cs="Times New Roman"/>
-          <w:kern w:val="0"/>
-          <w:sz w:val="32"/>
-          <w:szCs w:val="32"/>
-          <w:lang w:val="en-GB" w:eastAsia="nb-NO"/>
-          <w14:ligatures w14:val="none"/>
-        </w:rPr>
-        <w:t>Add synchronized keyword to synchronize two threads. Run the new code several times and include outputs in your report. Do you get the same output for all runs?</w:t>
+          <w:sz w:val="28"/>
+          <w:szCs w:val="28"/>
+          <w:lang w:val="en-GB" w:eastAsia="nb-NO"/>
+          <w14:ligatures w14:val="none"/>
+        </w:rPr>
+      </w:pPr>
+      <w:r>
+        <w:rPr>
+          <w:rFonts w:ascii="Times New Roman" w:eastAsiaTheme="majorEastAsia" w:hAnsi="Times New Roman" w:cs="Times New Roman"/>
+          <w:kern w:val="0"/>
+          <w:sz w:val="28"/>
+          <w:szCs w:val="28"/>
+          <w:u w:val="single"/>
+          <w:lang w:val="en-GB" w:eastAsia="nb-NO"/>
+          <w14:ligatures w14:val="none"/>
+        </w:rPr>
+        <w:t xml:space="preserve">Subtask 3: Add synchronized keyword to synchronize two threads. </w:t>
+      </w:r>
+      <w:r>
+        <w:rPr>
+          <w:rFonts w:ascii="Times New Roman" w:eastAsiaTheme="majorEastAsia" w:hAnsi="Times New Roman" w:cs="Times New Roman"/>
+          <w:kern w:val="0"/>
+          <w:sz w:val="28"/>
+          <w:szCs w:val="28"/>
+          <w:lang w:val="en-GB" w:eastAsia="nb-NO"/>
+          <w14:ligatures w14:val="none"/>
+        </w:rPr>
+        <w:t>Run the new code several times and include outputs in your report. Do you get the same output for all runs?</w:t>
+      </w:r>
+    </w:p>
+    <w:p>
+      <w:pPr>
+        <w:pStyle w:val="Listeavsnitt"/>
+        <w:keepNext/>
+        <w:keepLines/>
+        <w:numPr>
+          <w:ilvl w:val="1"/>
+          <w:numId w:val="14"/>
+        </w:numPr>
+        <w:spacing w:before="360" w:after="120" w:line="360" w:lineRule="auto"/>
+        <w:ind w:right="360"/>
+        <w:outlineLvl w:val="0"/>
+        <w:rPr>
+          <w:rFonts w:ascii="Times New Roman" w:eastAsiaTheme="majorEastAsia" w:hAnsi="Times New Roman" w:cs="Times New Roman"/>
+          <w:kern w:val="0"/>
+          <w:lang w:val="en-GB" w:eastAsia="nb-NO"/>
+          <w14:ligatures w14:val="none"/>
+        </w:rPr>
+      </w:pPr>
+      <w:r>
+        <w:rPr>
+          <w:rFonts w:ascii="Times New Roman" w:eastAsiaTheme="majorEastAsia" w:hAnsi="Times New Roman" w:cs="Times New Roman"/>
+          <w:kern w:val="0"/>
+          <w:lang w:val="en-GB" w:eastAsia="nb-NO"/>
+          <w14:ligatures w14:val="none"/>
+        </w:rPr>
+        <w:t xml:space="preserve">After adding the keyword </w:t>
+      </w:r>
+      <w:r>
+        <w:rPr>
+          <w:rFonts w:ascii="Times New Roman" w:eastAsiaTheme="majorEastAsia" w:hAnsi="Times New Roman" w:cs="Times New Roman"/>
+          <w:i/>
+          <w:iCs/>
+          <w:kern w:val="0"/>
+          <w:lang w:val="en-GB" w:eastAsia="nb-NO"/>
+          <w14:ligatures w14:val="none"/>
+        </w:rPr>
+        <w:t>synchronized,</w:t>
+      </w:r>
+      <w:r>
+        <w:rPr>
+          <w:rFonts w:ascii="Times New Roman" w:eastAsiaTheme="majorEastAsia" w:hAnsi="Times New Roman" w:cs="Times New Roman"/>
+          <w:kern w:val="0"/>
+          <w:lang w:val="en-GB" w:eastAsia="nb-NO"/>
+          <w14:ligatures w14:val="none"/>
+        </w:rPr>
+        <w:t xml:space="preserve"> I always got the same output for all runs. </w:t>
+      </w:r>
+      <w:r>
+        <w:rPr>
+          <w:rFonts w:ascii="Times New Roman" w:eastAsiaTheme="majorEastAsia" w:hAnsi="Times New Roman" w:cs="Times New Roman"/>
+          <w:kern w:val="0"/>
+          <w:lang w:val="en-GB" w:eastAsia="nb-NO"/>
+          <w14:ligatures w14:val="none"/>
+        </w:rPr>
+        <w:t>On the other hand, when</w:t>
+      </w:r>
+      <w:r>
+        <w:rPr>
+          <w:rFonts w:ascii="Times New Roman" w:eastAsiaTheme="majorEastAsia" w:hAnsi="Times New Roman" w:cs="Times New Roman"/>
+          <w:kern w:val="0"/>
+          <w:lang w:val="en-GB" w:eastAsia="nb-NO"/>
+          <w14:ligatures w14:val="none"/>
+        </w:rPr>
+        <w:t xml:space="preserve"> the code is synchronized </w:t>
+      </w:r>
+      <w:r>
+        <w:rPr>
+          <w:rFonts w:ascii="Times New Roman" w:eastAsiaTheme="majorEastAsia" w:hAnsi="Times New Roman" w:cs="Times New Roman"/>
+          <w:kern w:val="0"/>
+          <w:lang w:val="en-GB" w:eastAsia="nb-NO"/>
+          <w14:ligatures w14:val="none"/>
+        </w:rPr>
+        <w:t xml:space="preserve">it is approximately twice as slow as unsynchronized. </w:t>
+      </w:r>
+    </w:p>
+    <w:p>
+      <w:pPr>
+        <w:pStyle w:val="Listeavsnitt"/>
+        <w:keepNext/>
+        <w:keepLines/>
+        <w:spacing w:before="360" w:after="120" w:line="360" w:lineRule="auto"/>
+        <w:ind w:right="360"/>
+        <w:outlineLvl w:val="0"/>
+        <w:rPr>
+          <w:rFonts w:ascii="Times New Roman" w:eastAsiaTheme="majorEastAsia" w:hAnsi="Times New Roman" w:cs="Times New Roman"/>
+          <w:kern w:val="0"/>
+          <w:sz w:val="28"/>
+          <w:szCs w:val="28"/>
+          <w:lang w:val="en-GB" w:eastAsia="nb-NO"/>
+          <w14:ligatures w14:val="none"/>
+        </w:rPr>
+      </w:pPr>
+      <w:r>
+        <w:rPr>
+          <w:rFonts w:ascii="Times New Roman" w:eastAsiaTheme="majorEastAsia" w:hAnsi="Times New Roman" w:cs="Times New Roman"/>
+          <w:kern w:val="0"/>
+          <w:sz w:val="28"/>
+          <w:szCs w:val="28"/>
+          <w:lang w:val="en-GB" w:eastAsia="nb-NO"/>
+          <w14:ligatures w14:val="none"/>
+        </w:rPr>
+        <w:drawing>
+          <wp:inline distT="0" distB="0" distL="0" distR="0" wp14:anchorId="2F7CAE11" wp14:editId="27656CDB">
+            <wp:extent cx="2888878" cy="3022332"/>
+            <wp:effectExtent l="0" t="0" r="0" b="635"/>
+            <wp:docPr id="1474130079" name="Bilde 1" descr="Et bilde som inneholder tekst, skjermbilde, programvare&#10;&#10;KI-generert innhold kan være feil."/>
+            <wp:cNvGraphicFramePr>
+              <a:graphicFrameLocks xmlns:a="http://schemas.openxmlformats.org/drawingml/2006/main" noChangeAspect="1"/>
+            </wp:cNvGraphicFramePr>
+            <a:graphic xmlns:a="http://schemas.openxmlformats.org/drawingml/2006/main">
+              <a:graphicData uri="http://schemas.openxmlformats.org/drawingml/2006/picture">
+                <pic:pic xmlns:pic="http://schemas.openxmlformats.org/drawingml/2006/picture">
+                  <pic:nvPicPr>
+                    <pic:cNvPr id="1474130079" name="Bilde 1" descr="Et bilde som inneholder tekst, skjermbilde, programvare&#10;&#10;KI-generert innhold kan være feil."/>
+                    <pic:cNvPicPr/>
+                  </pic:nvPicPr>
+                  <pic:blipFill>
+                    <a:blip r:embed="rId8"/>
+                    <a:stretch>
+                      <a:fillRect/>
+                    </a:stretch>
+                  </pic:blipFill>
+                  <pic:spPr>
+                    <a:xfrm>
+                      <a:off x="0" y="0"/>
+                      <a:ext cx="2904501" cy="3038677"/>
+                    </a:xfrm>
+                    <a:prstGeom prst="rect">
+                      <a:avLst/>
+                    </a:prstGeom>
+                  </pic:spPr>
+                </pic:pic>
+              </a:graphicData>
+            </a:graphic>
+          </wp:inline>
+        </w:drawing>
       </w:r>
     </w:p>
     <w:p>
@@ -386,18 +821,18 @@
         <w:rPr>
           <w:rFonts w:ascii="Times New Roman" w:eastAsiaTheme="majorEastAsia" w:hAnsi="Times New Roman" w:cs="Times New Roman"/>
           <w:kern w:val="0"/>
-          <w:sz w:val="32"/>
-          <w:szCs w:val="32"/>
-          <w:lang w:val="en-GB" w:eastAsia="nb-NO"/>
-          <w14:ligatures w14:val="none"/>
-        </w:rPr>
-      </w:pPr>
-      <w:r>
-        <w:rPr>
-          <w:rFonts w:ascii="Times New Roman" w:eastAsiaTheme="majorEastAsia" w:hAnsi="Times New Roman" w:cs="Times New Roman"/>
-          <w:kern w:val="0"/>
-          <w:sz w:val="32"/>
-          <w:szCs w:val="32"/>
+          <w:sz w:val="26"/>
+          <w:szCs w:val="26"/>
+          <w:lang w:val="en-GB" w:eastAsia="nb-NO"/>
+          <w14:ligatures w14:val="none"/>
+        </w:rPr>
+      </w:pPr>
+      <w:r>
+        <w:rPr>
+          <w:rFonts w:ascii="Times New Roman" w:eastAsiaTheme="majorEastAsia" w:hAnsi="Times New Roman" w:cs="Times New Roman"/>
+          <w:kern w:val="0"/>
+          <w:sz w:val="26"/>
+          <w:szCs w:val="26"/>
           <w:lang w:val="en-GB" w:eastAsia="nb-NO"/>
           <w14:ligatures w14:val="none"/>
         </w:rPr>
@@ -410,8 +845,8 @@
           <w:i/>
           <w:iCs/>
           <w:kern w:val="0"/>
-          <w:sz w:val="32"/>
-          <w:szCs w:val="32"/>
+          <w:sz w:val="26"/>
+          <w:szCs w:val="26"/>
           <w:lang w:val="en-GB" w:eastAsia="nb-NO"/>
           <w14:ligatures w14:val="none"/>
         </w:rPr>
@@ -422,8 +857,8 @@
         <w:rPr>
           <w:rFonts w:ascii="Times New Roman" w:eastAsiaTheme="majorEastAsia" w:hAnsi="Times New Roman" w:cs="Times New Roman"/>
           <w:kern w:val="0"/>
-          <w:sz w:val="32"/>
-          <w:szCs w:val="32"/>
+          <w:sz w:val="26"/>
+          <w:szCs w:val="26"/>
           <w:lang w:val="en-GB" w:eastAsia="nb-NO"/>
           <w14:ligatures w14:val="none"/>
         </w:rPr>
@@ -445,33 +880,22 @@
         <w:rPr>
           <w:rFonts w:ascii="Times New Roman" w:eastAsiaTheme="majorEastAsia" w:hAnsi="Times New Roman" w:cs="Times New Roman"/>
           <w:kern w:val="0"/>
-          <w:sz w:val="32"/>
-          <w:szCs w:val="32"/>
-          <w:lang w:val="en-GB" w:eastAsia="nb-NO"/>
-          <w14:ligatures w14:val="none"/>
-        </w:rPr>
-      </w:pPr>
-      <w:r>
-        <w:rPr>
-          <w:rFonts w:ascii="Times New Roman" w:eastAsiaTheme="majorEastAsia" w:hAnsi="Times New Roman" w:cs="Times New Roman"/>
-          <w:kern w:val="0"/>
-          <w:sz w:val="32"/>
-          <w:szCs w:val="32"/>
-          <w:lang w:val="en-GB" w:eastAsia="nb-NO"/>
-          <w14:ligatures w14:val="none"/>
-        </w:rPr>
-        <w:t xml:space="preserve">Subtask 2: </w:t>
-      </w:r>
-      <w:r>
-        <w:rPr>
-          <w:rFonts w:ascii="Times New Roman" w:eastAsiaTheme="majorEastAsia" w:hAnsi="Times New Roman" w:cs="Times New Roman"/>
-          <w:kern w:val="0"/>
-          <w:sz w:val="32"/>
-          <w:szCs w:val="32"/>
-          <w:lang w:val="en-GB" w:eastAsia="nb-NO"/>
-          <w14:ligatures w14:val="none"/>
-        </w:rPr>
-        <w:t>Which synchronization mechanism(s) and method(s) are used to synchronize the Producer thread and the Consumer thread in this package?</w:t>
+          <w:sz w:val="26"/>
+          <w:szCs w:val="26"/>
+          <w:lang w:val="en-GB" w:eastAsia="nb-NO"/>
+          <w14:ligatures w14:val="none"/>
+        </w:rPr>
+      </w:pPr>
+      <w:r>
+        <w:rPr>
+          <w:rFonts w:ascii="Times New Roman" w:eastAsiaTheme="majorEastAsia" w:hAnsi="Times New Roman" w:cs="Times New Roman"/>
+          <w:kern w:val="0"/>
+          <w:sz w:val="26"/>
+          <w:szCs w:val="26"/>
+          <w:lang w:val="en-GB" w:eastAsia="nb-NO"/>
+          <w14:ligatures w14:val="none"/>
+        </w:rPr>
+        <w:t>Subtask 2: Which synchronization mechanism(s) and method(s) are used to synchronize the Producer thread and the Consumer thread in this package?</w:t>
       </w:r>
     </w:p>
     <w:p>
@@ -489,18 +913,18 @@
         <w:rPr>
           <w:rFonts w:ascii="Times New Roman" w:eastAsiaTheme="majorEastAsia" w:hAnsi="Times New Roman" w:cs="Times New Roman"/>
           <w:kern w:val="0"/>
-          <w:sz w:val="32"/>
-          <w:szCs w:val="32"/>
-          <w:lang w:val="en-GB" w:eastAsia="nb-NO"/>
-          <w14:ligatures w14:val="none"/>
-        </w:rPr>
-      </w:pPr>
-      <w:r>
-        <w:rPr>
-          <w:rFonts w:ascii="Times New Roman" w:eastAsiaTheme="majorEastAsia" w:hAnsi="Times New Roman" w:cs="Times New Roman"/>
-          <w:kern w:val="0"/>
-          <w:sz w:val="32"/>
-          <w:szCs w:val="32"/>
+          <w:sz w:val="26"/>
+          <w:szCs w:val="26"/>
+          <w:lang w:val="en-GB" w:eastAsia="nb-NO"/>
+          <w14:ligatures w14:val="none"/>
+        </w:rPr>
+      </w:pPr>
+      <w:r>
+        <w:rPr>
+          <w:rFonts w:ascii="Times New Roman" w:eastAsiaTheme="majorEastAsia" w:hAnsi="Times New Roman" w:cs="Times New Roman"/>
+          <w:kern w:val="0"/>
+          <w:sz w:val="26"/>
+          <w:szCs w:val="26"/>
           <w:lang w:val="en-GB" w:eastAsia="nb-NO"/>
           <w14:ligatures w14:val="none"/>
         </w:rPr>
@@ -509,6 +933,8 @@
       <w:r>
         <w:rPr>
           <w:rFonts w:ascii="Times New Roman" w:hAnsi="Times New Roman" w:cs="Times New Roman"/>
+          <w:sz w:val="26"/>
+          <w:szCs w:val="26"/>
           <w:lang w:val="en-GB"/>
         </w:rPr>
         <w:t xml:space="preserve"> </w:t>
@@ -517,8 +943,8 @@
         <w:rPr>
           <w:rFonts w:ascii="Times New Roman" w:eastAsiaTheme="majorEastAsia" w:hAnsi="Times New Roman" w:cs="Times New Roman"/>
           <w:kern w:val="0"/>
-          <w:sz w:val="32"/>
-          <w:szCs w:val="32"/>
+          <w:sz w:val="26"/>
+          <w:szCs w:val="26"/>
           <w:lang w:val="en-GB" w:eastAsia="nb-NO"/>
           <w14:ligatures w14:val="none"/>
         </w:rPr>
@@ -572,33 +998,23 @@
         <w:rPr>
           <w:rFonts w:ascii="Times New Roman" w:eastAsiaTheme="majorEastAsia" w:hAnsi="Times New Roman" w:cs="Times New Roman"/>
           <w:kern w:val="0"/>
-          <w:sz w:val="32"/>
-          <w:szCs w:val="32"/>
-          <w:lang w:val="en-GB" w:eastAsia="nb-NO"/>
-          <w14:ligatures w14:val="none"/>
-        </w:rPr>
-      </w:pPr>
-      <w:r>
-        <w:rPr>
-          <w:rFonts w:ascii="Times New Roman" w:eastAsiaTheme="majorEastAsia" w:hAnsi="Times New Roman" w:cs="Times New Roman"/>
-          <w:kern w:val="0"/>
-          <w:sz w:val="32"/>
-          <w:szCs w:val="32"/>
-          <w:lang w:val="en-GB" w:eastAsia="nb-NO"/>
-          <w14:ligatures w14:val="none"/>
-        </w:rPr>
-        <w:t xml:space="preserve">Subtask 1: </w:t>
-      </w:r>
-      <w:r>
-        <w:rPr>
-          <w:rFonts w:ascii="Times New Roman" w:eastAsiaTheme="majorEastAsia" w:hAnsi="Times New Roman" w:cs="Times New Roman"/>
-          <w:kern w:val="0"/>
-          <w:sz w:val="32"/>
-          <w:szCs w:val="32"/>
-          <w:lang w:val="en-GB" w:eastAsia="nb-NO"/>
-          <w14:ligatures w14:val="none"/>
-        </w:rPr>
-        <w:t>Explain why data race occurs</w:t>
+          <w:sz w:val="28"/>
+          <w:szCs w:val="28"/>
+          <w:lang w:val="en-GB" w:eastAsia="nb-NO"/>
+          <w14:ligatures w14:val="none"/>
+        </w:rPr>
+      </w:pPr>
+      <w:r>
+        <w:rPr>
+          <w:rFonts w:ascii="Times New Roman" w:eastAsiaTheme="majorEastAsia" w:hAnsi="Times New Roman" w:cs="Times New Roman"/>
+          <w:kern w:val="0"/>
+          <w:sz w:val="28"/>
+          <w:szCs w:val="28"/>
+          <w:lang w:val="en-GB" w:eastAsia="nb-NO"/>
+          <w14:ligatures w14:val="none"/>
+        </w:rPr>
+        <w:lastRenderedPageBreak/>
+        <w:t>Subtask 1: Explain why data race occurs</w:t>
       </w:r>
     </w:p>
     <w:p>
@@ -616,33 +1032,22 @@
         <w:rPr>
           <w:rFonts w:ascii="Times New Roman" w:eastAsiaTheme="majorEastAsia" w:hAnsi="Times New Roman" w:cs="Times New Roman"/>
           <w:kern w:val="0"/>
-          <w:sz w:val="32"/>
-          <w:szCs w:val="32"/>
-          <w:lang w:val="en-GB" w:eastAsia="nb-NO"/>
-          <w14:ligatures w14:val="none"/>
-        </w:rPr>
-      </w:pPr>
-      <w:r>
-        <w:rPr>
-          <w:rFonts w:ascii="Times New Roman" w:eastAsiaTheme="majorEastAsia" w:hAnsi="Times New Roman" w:cs="Times New Roman"/>
-          <w:kern w:val="0"/>
-          <w:sz w:val="32"/>
-          <w:szCs w:val="32"/>
-          <w:lang w:val="en-GB" w:eastAsia="nb-NO"/>
-          <w14:ligatures w14:val="none"/>
-        </w:rPr>
-        <w:t xml:space="preserve">Subtask 2: </w:t>
-      </w:r>
-      <w:r>
-        <w:rPr>
-          <w:rFonts w:ascii="Times New Roman" w:eastAsiaTheme="majorEastAsia" w:hAnsi="Times New Roman" w:cs="Times New Roman"/>
-          <w:kern w:val="0"/>
-          <w:sz w:val="32"/>
-          <w:szCs w:val="32"/>
-          <w:lang w:val="en-GB" w:eastAsia="nb-NO"/>
-          <w14:ligatures w14:val="none"/>
-        </w:rPr>
-        <w:t>Where are the critical sections</w:t>
+          <w:sz w:val="28"/>
+          <w:szCs w:val="28"/>
+          <w:lang w:val="en-GB" w:eastAsia="nb-NO"/>
+          <w14:ligatures w14:val="none"/>
+        </w:rPr>
+      </w:pPr>
+      <w:r>
+        <w:rPr>
+          <w:rFonts w:ascii="Times New Roman" w:eastAsiaTheme="majorEastAsia" w:hAnsi="Times New Roman" w:cs="Times New Roman"/>
+          <w:kern w:val="0"/>
+          <w:sz w:val="28"/>
+          <w:szCs w:val="28"/>
+          <w:lang w:val="en-GB" w:eastAsia="nb-NO"/>
+          <w14:ligatures w14:val="none"/>
+        </w:rPr>
+        <w:t>Subtask 2: Where are the critical sections</w:t>
       </w:r>
     </w:p>
     <w:p>
@@ -660,18 +1065,18 @@
         <w:rPr>
           <w:rFonts w:ascii="Times New Roman" w:eastAsiaTheme="majorEastAsia" w:hAnsi="Times New Roman" w:cs="Times New Roman"/>
           <w:kern w:val="0"/>
-          <w:sz w:val="32"/>
-          <w:szCs w:val="32"/>
-          <w:lang w:val="en-GB" w:eastAsia="nb-NO"/>
-          <w14:ligatures w14:val="none"/>
-        </w:rPr>
-      </w:pPr>
-      <w:r>
-        <w:rPr>
-          <w:rFonts w:ascii="Times New Roman" w:eastAsiaTheme="majorEastAsia" w:hAnsi="Times New Roman" w:cs="Times New Roman"/>
-          <w:kern w:val="0"/>
-          <w:sz w:val="32"/>
-          <w:szCs w:val="32"/>
+          <w:sz w:val="28"/>
+          <w:szCs w:val="28"/>
+          <w:lang w:val="en-GB" w:eastAsia="nb-NO"/>
+          <w14:ligatures w14:val="none"/>
+        </w:rPr>
+      </w:pPr>
+      <w:r>
+        <w:rPr>
+          <w:rFonts w:ascii="Times New Roman" w:eastAsiaTheme="majorEastAsia" w:hAnsi="Times New Roman" w:cs="Times New Roman"/>
+          <w:kern w:val="0"/>
+          <w:sz w:val="28"/>
+          <w:szCs w:val="28"/>
           <w:lang w:val="en-GB" w:eastAsia="nb-NO"/>
           <w14:ligatures w14:val="none"/>
         </w:rPr>
@@ -680,20 +1085,11 @@
       <w:r>
         <w:rPr>
           <w:rFonts w:ascii="Times New Roman" w:hAnsi="Times New Roman" w:cs="Times New Roman"/>
-          <w:sz w:val="32"/>
-          <w:szCs w:val="32"/>
+          <w:sz w:val="28"/>
+          <w:szCs w:val="28"/>
           <w:lang w:val="en-GB"/>
         </w:rPr>
-        <w:t xml:space="preserve"> </w:t>
-      </w:r>
-      <w:r>
-        <w:rPr>
-          <w:rFonts w:ascii="Times New Roman" w:hAnsi="Times New Roman" w:cs="Times New Roman"/>
-          <w:sz w:val="32"/>
-          <w:szCs w:val="32"/>
-          <w:lang w:val="en-GB"/>
-        </w:rPr>
-        <w:t>Fix the data inconsistency problem using Monitor</w:t>
+        <w:t xml:space="preserve"> Fix the data inconsistency problem using Monitor</w:t>
       </w:r>
     </w:p>
     <w:p>
@@ -711,8 +1107,8 @@
         <w:rPr>
           <w:rFonts w:ascii="Times New Roman" w:eastAsiaTheme="majorEastAsia" w:hAnsi="Times New Roman" w:cs="Times New Roman"/>
           <w:kern w:val="0"/>
-          <w:sz w:val="32"/>
-          <w:szCs w:val="32"/>
+          <w:sz w:val="28"/>
+          <w:szCs w:val="28"/>
           <w:lang w:val="en-GB" w:eastAsia="nb-NO"/>
           <w14:ligatures w14:val="none"/>
         </w:rPr>
@@ -720,8 +1116,8 @@
       <w:r>
         <w:rPr>
           <w:rFonts w:ascii="Times New Roman" w:hAnsi="Times New Roman" w:cs="Times New Roman"/>
-          <w:sz w:val="32"/>
-          <w:szCs w:val="32"/>
+          <w:sz w:val="28"/>
+          <w:szCs w:val="28"/>
           <w:lang w:val="en-GB"/>
         </w:rPr>
         <w:t>Subtask 4: Fix the data inconsistency using Lock</w:t>
@@ -774,34 +1170,22 @@
         <w:rPr>
           <w:rFonts w:ascii="Times New Roman" w:eastAsiaTheme="majorEastAsia" w:hAnsi="Times New Roman" w:cs="Times New Roman"/>
           <w:kern w:val="0"/>
-          <w:sz w:val="32"/>
-          <w:szCs w:val="32"/>
-          <w:lang w:val="en-GB" w:eastAsia="nb-NO"/>
-          <w14:ligatures w14:val="none"/>
-        </w:rPr>
-      </w:pPr>
-      <w:r>
-        <w:rPr>
-          <w:rFonts w:ascii="Times New Roman" w:eastAsiaTheme="majorEastAsia" w:hAnsi="Times New Roman" w:cs="Times New Roman"/>
-          <w:kern w:val="0"/>
-          <w:sz w:val="32"/>
-          <w:szCs w:val="32"/>
-          <w:lang w:val="en-GB" w:eastAsia="nb-NO"/>
-          <w14:ligatures w14:val="none"/>
-        </w:rPr>
-        <w:lastRenderedPageBreak/>
-        <w:t xml:space="preserve">Subtask 1: </w:t>
-      </w:r>
-      <w:r>
-        <w:rPr>
-          <w:rFonts w:ascii="Times New Roman" w:eastAsiaTheme="majorEastAsia" w:hAnsi="Times New Roman" w:cs="Times New Roman"/>
-          <w:kern w:val="0"/>
-          <w:sz w:val="32"/>
-          <w:szCs w:val="32"/>
-          <w:lang w:val="en-GB" w:eastAsia="nb-NO"/>
-          <w14:ligatures w14:val="none"/>
-        </w:rPr>
-        <w:t>Run the two implementations – include outputs</w:t>
+          <w:sz w:val="28"/>
+          <w:szCs w:val="28"/>
+          <w:lang w:val="en-GB" w:eastAsia="nb-NO"/>
+          <w14:ligatures w14:val="none"/>
+        </w:rPr>
+      </w:pPr>
+      <w:r>
+        <w:rPr>
+          <w:rFonts w:ascii="Times New Roman" w:eastAsiaTheme="majorEastAsia" w:hAnsi="Times New Roman" w:cs="Times New Roman"/>
+          <w:kern w:val="0"/>
+          <w:sz w:val="28"/>
+          <w:szCs w:val="28"/>
+          <w:lang w:val="en-GB" w:eastAsia="nb-NO"/>
+          <w14:ligatures w14:val="none"/>
+        </w:rPr>
+        <w:t>Subtask 1: Run the two implementations – include outputs</w:t>
       </w:r>
     </w:p>
     <w:p>
@@ -819,33 +1203,22 @@
         <w:rPr>
           <w:rFonts w:ascii="Times New Roman" w:eastAsiaTheme="majorEastAsia" w:hAnsi="Times New Roman" w:cs="Times New Roman"/>
           <w:kern w:val="0"/>
-          <w:sz w:val="32"/>
-          <w:szCs w:val="32"/>
-          <w:lang w:val="en-GB" w:eastAsia="nb-NO"/>
-          <w14:ligatures w14:val="none"/>
-        </w:rPr>
-      </w:pPr>
-      <w:r>
-        <w:rPr>
-          <w:rFonts w:ascii="Times New Roman" w:eastAsiaTheme="majorEastAsia" w:hAnsi="Times New Roman" w:cs="Times New Roman"/>
-          <w:kern w:val="0"/>
-          <w:sz w:val="32"/>
-          <w:szCs w:val="32"/>
-          <w:lang w:val="en-GB" w:eastAsia="nb-NO"/>
-          <w14:ligatures w14:val="none"/>
-        </w:rPr>
-        <w:t xml:space="preserve">Subtask 2: </w:t>
-      </w:r>
-      <w:r>
-        <w:rPr>
-          <w:rFonts w:ascii="Times New Roman" w:eastAsiaTheme="majorEastAsia" w:hAnsi="Times New Roman" w:cs="Times New Roman"/>
-          <w:kern w:val="0"/>
-          <w:sz w:val="32"/>
-          <w:szCs w:val="32"/>
-          <w:lang w:val="en-GB" w:eastAsia="nb-NO"/>
-          <w14:ligatures w14:val="none"/>
-        </w:rPr>
-        <w:t xml:space="preserve">Expected output of </w:t>
+          <w:sz w:val="28"/>
+          <w:szCs w:val="28"/>
+          <w:lang w:val="en-GB" w:eastAsia="nb-NO"/>
+          <w14:ligatures w14:val="none"/>
+        </w:rPr>
+      </w:pPr>
+      <w:r>
+        <w:rPr>
+          <w:rFonts w:ascii="Times New Roman" w:eastAsiaTheme="majorEastAsia" w:hAnsi="Times New Roman" w:cs="Times New Roman"/>
+          <w:kern w:val="0"/>
+          <w:sz w:val="28"/>
+          <w:szCs w:val="28"/>
+          <w:lang w:val="en-GB" w:eastAsia="nb-NO"/>
+          <w14:ligatures w14:val="none"/>
+        </w:rPr>
+        <w:t xml:space="preserve">Subtask 2: Expected output of </w:t>
       </w:r>
       <w:proofErr w:type="spellStart"/>
       <w:r>
@@ -854,8 +1227,8 @@
           <w:i/>
           <w:iCs/>
           <w:kern w:val="0"/>
-          <w:sz w:val="32"/>
-          <w:szCs w:val="32"/>
+          <w:sz w:val="28"/>
+          <w:szCs w:val="28"/>
           <w:lang w:val="en-GB" w:eastAsia="nb-NO"/>
           <w14:ligatures w14:val="none"/>
         </w:rPr>
@@ -866,8 +1239,8 @@
         <w:rPr>
           <w:rFonts w:ascii="Times New Roman" w:eastAsiaTheme="majorEastAsia" w:hAnsi="Times New Roman" w:cs="Times New Roman"/>
           <w:kern w:val="0"/>
-          <w:sz w:val="32"/>
-          <w:szCs w:val="32"/>
+          <w:sz w:val="28"/>
+          <w:szCs w:val="28"/>
           <w:lang w:val="en-GB" w:eastAsia="nb-NO"/>
           <w14:ligatures w14:val="none"/>
         </w:rPr>
@@ -880,8 +1253,8 @@
           <w:i/>
           <w:iCs/>
           <w:kern w:val="0"/>
-          <w:sz w:val="32"/>
-          <w:szCs w:val="32"/>
+          <w:sz w:val="28"/>
+          <w:szCs w:val="28"/>
           <w:lang w:val="en-GB" w:eastAsia="nb-NO"/>
           <w14:ligatures w14:val="none"/>
         </w:rPr>
@@ -892,8 +1265,8 @@
         <w:rPr>
           <w:rFonts w:ascii="Times New Roman" w:eastAsiaTheme="majorEastAsia" w:hAnsi="Times New Roman" w:cs="Times New Roman"/>
           <w:kern w:val="0"/>
-          <w:sz w:val="32"/>
-          <w:szCs w:val="32"/>
+          <w:sz w:val="28"/>
+          <w:szCs w:val="28"/>
           <w:lang w:val="en-GB" w:eastAsia="nb-NO"/>
           <w14:ligatures w14:val="none"/>
         </w:rPr>
@@ -915,33 +1288,22 @@
         <w:rPr>
           <w:rFonts w:ascii="Times New Roman" w:eastAsiaTheme="majorEastAsia" w:hAnsi="Times New Roman" w:cs="Times New Roman"/>
           <w:kern w:val="0"/>
-          <w:sz w:val="36"/>
-          <w:szCs w:val="36"/>
-          <w:lang w:val="en-GB" w:eastAsia="nb-NO"/>
-          <w14:ligatures w14:val="none"/>
-        </w:rPr>
-      </w:pPr>
-      <w:r>
-        <w:rPr>
-          <w:rFonts w:ascii="Times New Roman" w:eastAsiaTheme="majorEastAsia" w:hAnsi="Times New Roman" w:cs="Times New Roman"/>
-          <w:kern w:val="0"/>
-          <w:sz w:val="32"/>
-          <w:szCs w:val="32"/>
-          <w:lang w:val="en-GB" w:eastAsia="nb-NO"/>
-          <w14:ligatures w14:val="none"/>
-        </w:rPr>
-        <w:t>Subtask 3</w:t>
-      </w:r>
-      <w:r>
-        <w:rPr>
-          <w:rFonts w:ascii="Times New Roman" w:eastAsiaTheme="majorEastAsia" w:hAnsi="Times New Roman" w:cs="Times New Roman"/>
-          <w:kern w:val="0"/>
-          <w:sz w:val="32"/>
-          <w:szCs w:val="32"/>
-          <w:lang w:val="en-GB" w:eastAsia="nb-NO"/>
-          <w14:ligatures w14:val="none"/>
-        </w:rPr>
-        <w:t xml:space="preserve">: Discuss the data race issue focusing on the use of the </w:t>
+          <w:sz w:val="28"/>
+          <w:szCs w:val="28"/>
+          <w:lang w:val="en-GB" w:eastAsia="nb-NO"/>
+          <w14:ligatures w14:val="none"/>
+        </w:rPr>
+      </w:pPr>
+      <w:r>
+        <w:rPr>
+          <w:rFonts w:ascii="Times New Roman" w:eastAsiaTheme="majorEastAsia" w:hAnsi="Times New Roman" w:cs="Times New Roman"/>
+          <w:kern w:val="0"/>
+          <w:sz w:val="28"/>
+          <w:szCs w:val="28"/>
+          <w:lang w:val="en-GB" w:eastAsia="nb-NO"/>
+          <w14:ligatures w14:val="none"/>
+        </w:rPr>
+        <w:t xml:space="preserve">Subtask 3: Discuss the data race issue focusing on the use of the </w:t>
       </w:r>
       <w:r>
         <w:rPr>
@@ -949,8 +1311,8 @@
           <w:i/>
           <w:iCs/>
           <w:kern w:val="0"/>
-          <w:sz w:val="32"/>
-          <w:szCs w:val="32"/>
+          <w:sz w:val="28"/>
+          <w:szCs w:val="28"/>
           <w:lang w:val="en-GB" w:eastAsia="nb-NO"/>
           <w14:ligatures w14:val="none"/>
         </w:rPr>
@@ -960,8 +1322,8 @@
         <w:rPr>
           <w:rFonts w:ascii="Times New Roman" w:eastAsiaTheme="majorEastAsia" w:hAnsi="Times New Roman" w:cs="Times New Roman"/>
           <w:kern w:val="0"/>
-          <w:sz w:val="32"/>
-          <w:szCs w:val="32"/>
+          <w:sz w:val="28"/>
+          <w:szCs w:val="28"/>
           <w:lang w:val="en-GB" w:eastAsia="nb-NO"/>
           <w14:ligatures w14:val="none"/>
         </w:rPr>
@@ -1815,7 +2177,7 @@
         <w:rFonts w:ascii="Times New Roman" w:eastAsiaTheme="majorEastAsia" w:hAnsi="Times New Roman" w:cs="Times New Roman" w:hint="default"/>
       </w:rPr>
     </w:lvl>
-    <w:lvl w:ilvl="1" w:tplc="04140003" w:tentative="1">
+    <w:lvl w:ilvl="1" w:tplc="04140003">
       <w:start w:val="1"/>
       <w:numFmt w:val="bullet"/>
       <w:lvlText w:val="o"/>

</xml_diff>

<commit_message>
lab6: Started on exercise 2
</commit_message>
<xml_diff>
--- a/lab6/lab6_report.docx
+++ b/lab6/lab6_report.docx
@@ -257,6 +257,7 @@
       <w:r>
         <w:rPr>
           <w:rFonts w:ascii="Times New Roman" w:eastAsiaTheme="majorEastAsia" w:hAnsi="Times New Roman" w:cs="Times New Roman"/>
+          <w:noProof/>
           <w:kern w:val="0"/>
           <w:lang w:val="en-GB" w:eastAsia="nb-NO"/>
           <w14:ligatures w14:val="none"/>
@@ -285,7 +286,7 @@
                     <pic:cNvPicPr/>
                   </pic:nvPicPr>
                   <pic:blipFill>
-                    <a:blip r:embed="rId5">
+                    <a:blip r:embed="rId7">
                       <a:extLst>
                         <a:ext uri="{28A0092B-C50C-407E-A947-70E740481C1C}">
                           <a14:useLocalDpi xmlns:a14="http://schemas.microsoft.com/office/drawing/2010/main" val="0"/>
@@ -348,6 +349,7 @@
       <w:r>
         <w:rPr>
           <w:rFonts w:ascii="Times New Roman" w:eastAsiaTheme="majorEastAsia" w:hAnsi="Times New Roman" w:cs="Times New Roman"/>
+          <w:noProof/>
           <w:kern w:val="0"/>
           <w:sz w:val="32"/>
           <w:szCs w:val="32"/>
@@ -355,7 +357,7 @@
           <w14:ligatures w14:val="none"/>
         </w:rPr>
         <w:drawing>
-          <wp:anchor distT="0" distB="0" distL="114300" distR="114300" simplePos="0" relativeHeight="251658240" behindDoc="0" locked="0" layoutInCell="1" allowOverlap="1" wp14:anchorId="29BDA7FF" wp14:editId="43FA05E2">
+          <wp:anchor distT="0" distB="0" distL="114300" distR="114300" simplePos="0" relativeHeight="251658240" behindDoc="0" locked="0" layoutInCell="1" allowOverlap="1" wp14:anchorId="29BDA7FF" wp14:editId="1D2EAC74">
             <wp:simplePos x="0" y="0"/>
             <wp:positionH relativeFrom="column">
               <wp:posOffset>-465455</wp:posOffset>
@@ -378,7 +380,7 @@
                     <pic:cNvPicPr/>
                   </pic:nvPicPr>
                   <pic:blipFill>
-                    <a:blip r:embed="rId6" cstate="print">
+                    <a:blip r:embed="rId8" cstate="print">
                       <a:extLst>
                         <a:ext uri="{28A0092B-C50C-407E-A947-70E740481C1C}">
                           <a14:useLocalDpi xmlns:a14="http://schemas.microsoft.com/office/drawing/2010/main" val="0"/>
@@ -430,6 +432,7 @@
       <w:r>
         <w:rPr>
           <w:rFonts w:ascii="Times New Roman" w:eastAsiaTheme="majorEastAsia" w:hAnsi="Times New Roman" w:cs="Times New Roman"/>
+          <w:noProof/>
           <w:kern w:val="0"/>
           <w:sz w:val="32"/>
           <w:szCs w:val="32"/>
@@ -460,7 +463,7 @@
                     <pic:cNvPicPr/>
                   </pic:nvPicPr>
                   <pic:blipFill>
-                    <a:blip r:embed="rId7">
+                    <a:blip r:embed="rId9">
                       <a:extLst>
                         <a:ext uri="{28A0092B-C50C-407E-A947-70E740481C1C}">
                           <a14:useLocalDpi xmlns:a14="http://schemas.microsoft.com/office/drawing/2010/main" val="0"/>
@@ -623,17 +626,6 @@
         </w:rPr>
         <w:t xml:space="preserve">Subtask 3: Add synchronized keyword to synchronize two threads. </w:t>
       </w:r>
-      <w:r>
-        <w:rPr>
-          <w:rFonts w:ascii="Times New Roman" w:eastAsiaTheme="majorEastAsia" w:hAnsi="Times New Roman" w:cs="Times New Roman"/>
-          <w:kern w:val="0"/>
-          <w:sz w:val="28"/>
-          <w:szCs w:val="28"/>
-          <w:lang w:val="en-GB" w:eastAsia="nb-NO"/>
-          <w14:ligatures w14:val="none"/>
-        </w:rPr>
-        <w:t>Run the new code several times and include outputs in your report. Do you get the same output for all runs?</w:t>
-      </w:r>
     </w:p>
     <w:p>
       <w:pPr>
@@ -731,6 +723,7 @@
       <w:r>
         <w:rPr>
           <w:rFonts w:ascii="Times New Roman" w:eastAsiaTheme="majorEastAsia" w:hAnsi="Times New Roman" w:cs="Times New Roman"/>
+          <w:noProof/>
           <w:kern w:val="0"/>
           <w:sz w:val="28"/>
           <w:szCs w:val="28"/>
@@ -738,9 +731,17 @@
           <w14:ligatures w14:val="none"/>
         </w:rPr>
         <w:drawing>
-          <wp:inline distT="0" distB="0" distL="0" distR="0" wp14:anchorId="2F7CAE11" wp14:editId="27656CDB">
-            <wp:extent cx="2888878" cy="3022332"/>
-            <wp:effectExtent l="0" t="0" r="0" b="635"/>
+          <wp:anchor distT="0" distB="0" distL="114300" distR="114300" simplePos="0" relativeHeight="251663360" behindDoc="0" locked="0" layoutInCell="1" allowOverlap="1" wp14:anchorId="2F7CAE11" wp14:editId="2566C8DD">
+            <wp:simplePos x="0" y="0"/>
+            <wp:positionH relativeFrom="column">
+              <wp:posOffset>832251</wp:posOffset>
+            </wp:positionH>
+            <wp:positionV relativeFrom="paragraph">
+              <wp:posOffset>342265</wp:posOffset>
+            </wp:positionV>
+            <wp:extent cx="3817620" cy="3994150"/>
+            <wp:effectExtent l="0" t="0" r="5080" b="6350"/>
+            <wp:wrapSquare wrapText="bothSides"/>
             <wp:docPr id="1474130079" name="Bilde 1" descr="Et bilde som inneholder tekst, skjermbilde, programvare&#10;&#10;KI-generert innhold kan være feil."/>
             <wp:cNvGraphicFramePr>
               <a:graphicFrameLocks xmlns:a="http://schemas.openxmlformats.org/drawingml/2006/main" noChangeAspect="1"/>
@@ -753,7 +754,13 @@
                     <pic:cNvPicPr/>
                   </pic:nvPicPr>
                   <pic:blipFill>
-                    <a:blip r:embed="rId8"/>
+                    <a:blip r:embed="rId10">
+                      <a:extLst>
+                        <a:ext uri="{28A0092B-C50C-407E-A947-70E740481C1C}">
+                          <a14:useLocalDpi xmlns:a14="http://schemas.microsoft.com/office/drawing/2010/main" val="0"/>
+                        </a:ext>
+                      </a:extLst>
+                    </a:blip>
                     <a:stretch>
                       <a:fillRect/>
                     </a:stretch>
@@ -761,7 +768,7 @@
                   <pic:spPr>
                     <a:xfrm>
                       <a:off x="0" y="0"/>
-                      <a:ext cx="2904501" cy="3038677"/>
+                      <a:ext cx="3817620" cy="3994150"/>
                     </a:xfrm>
                     <a:prstGeom prst="rect">
                       <a:avLst/>
@@ -770,8 +777,41 @@
                 </pic:pic>
               </a:graphicData>
             </a:graphic>
-          </wp:inline>
+            <wp14:sizeRelH relativeFrom="page">
+              <wp14:pctWidth>0</wp14:pctWidth>
+            </wp14:sizeRelH>
+            <wp14:sizeRelV relativeFrom="page">
+              <wp14:pctHeight>0</wp14:pctHeight>
+            </wp14:sizeRelV>
+          </wp:anchor>
         </w:drawing>
+      </w:r>
+    </w:p>
+    <w:p>
+      <w:pPr>
+        <w:rPr>
+          <w:rFonts w:ascii="Times New Roman" w:eastAsiaTheme="majorEastAsia" w:hAnsi="Times New Roman" w:cs="Times New Roman"/>
+          <w:b/>
+          <w:bCs/>
+          <w:kern w:val="0"/>
+          <w:sz w:val="36"/>
+          <w:szCs w:val="36"/>
+          <w:lang w:val="en-GB" w:eastAsia="nb-NO"/>
+          <w14:ligatures w14:val="none"/>
+        </w:rPr>
+      </w:pPr>
+      <w:r>
+        <w:rPr>
+          <w:rFonts w:ascii="Times New Roman" w:eastAsiaTheme="majorEastAsia" w:hAnsi="Times New Roman" w:cs="Times New Roman"/>
+          <w:b/>
+          <w:bCs/>
+          <w:kern w:val="0"/>
+          <w:sz w:val="36"/>
+          <w:szCs w:val="36"/>
+          <w:lang w:val="en-GB" w:eastAsia="nb-NO"/>
+          <w14:ligatures w14:val="none"/>
+        </w:rPr>
+        <w:br w:type="page"/>
       </w:r>
     </w:p>
     <w:p>
@@ -803,6 +843,7 @@
           <w:lang w:val="en-GB" w:eastAsia="nb-NO"/>
           <w14:ligatures w14:val="none"/>
         </w:rPr>
+        <w:lastRenderedPageBreak/>
         <w:t>Exercise 2: Refer to project lab6</w:t>
       </w:r>
     </w:p>
@@ -821,48 +862,237 @@
         <w:rPr>
           <w:rFonts w:ascii="Times New Roman" w:eastAsiaTheme="majorEastAsia" w:hAnsi="Times New Roman" w:cs="Times New Roman"/>
           <w:kern w:val="0"/>
+          <w:sz w:val="28"/>
+          <w:szCs w:val="28"/>
+          <w:u w:val="single"/>
+          <w:lang w:val="en-GB" w:eastAsia="nb-NO"/>
+          <w14:ligatures w14:val="none"/>
+        </w:rPr>
+      </w:pPr>
+      <w:r>
+        <w:rPr>
+          <w:rFonts w:ascii="Times New Roman" w:eastAsiaTheme="majorEastAsia" w:hAnsi="Times New Roman" w:cs="Times New Roman"/>
+          <w:kern w:val="0"/>
+          <w:sz w:val="28"/>
+          <w:szCs w:val="28"/>
+          <w:u w:val="single"/>
+          <w:lang w:val="en-GB" w:eastAsia="nb-NO"/>
+          <w14:ligatures w14:val="none"/>
+        </w:rPr>
+        <w:t xml:space="preserve">Subtask 1: Run package </w:t>
+      </w:r>
+      <w:proofErr w:type="spellStart"/>
+      <w:r>
+        <w:rPr>
+          <w:rFonts w:ascii="Times New Roman" w:eastAsiaTheme="majorEastAsia" w:hAnsi="Times New Roman" w:cs="Times New Roman"/>
+          <w:i/>
+          <w:iCs/>
+          <w:kern w:val="0"/>
+          <w:sz w:val="28"/>
+          <w:szCs w:val="28"/>
+          <w:u w:val="single"/>
+          <w:lang w:val="en-GB" w:eastAsia="nb-NO"/>
+          <w14:ligatures w14:val="none"/>
+        </w:rPr>
+        <w:t>producerConsumer</w:t>
+      </w:r>
+      <w:proofErr w:type="spellEnd"/>
+      <w:r>
+        <w:rPr>
+          <w:rFonts w:ascii="Times New Roman" w:eastAsiaTheme="majorEastAsia" w:hAnsi="Times New Roman" w:cs="Times New Roman"/>
+          <w:kern w:val="0"/>
+          <w:sz w:val="28"/>
+          <w:szCs w:val="28"/>
+          <w:u w:val="single"/>
+          <w:lang w:val="en-GB" w:eastAsia="nb-NO"/>
+          <w14:ligatures w14:val="none"/>
+        </w:rPr>
+        <w:t xml:space="preserve"> and include output</w:t>
+      </w:r>
+    </w:p>
+    <w:p>
+      <w:pPr>
+        <w:pStyle w:val="Listeavsnitt"/>
+        <w:keepNext/>
+        <w:keepLines/>
+        <w:numPr>
+          <w:ilvl w:val="1"/>
+          <w:numId w:val="14"/>
+        </w:numPr>
+        <w:spacing w:before="360" w:after="120" w:line="360" w:lineRule="auto"/>
+        <w:ind w:right="360"/>
+        <w:outlineLvl w:val="0"/>
+        <w:rPr>
+          <w:rFonts w:ascii="Times New Roman" w:eastAsiaTheme="majorEastAsia" w:hAnsi="Times New Roman" w:cs="Times New Roman"/>
+          <w:kern w:val="0"/>
+          <w:lang w:val="en-GB" w:eastAsia="nb-NO"/>
+          <w14:ligatures w14:val="none"/>
+        </w:rPr>
+      </w:pPr>
+      <w:r>
+        <w:rPr>
+          <w:rFonts w:ascii="Times New Roman" w:eastAsiaTheme="majorEastAsia" w:hAnsi="Times New Roman" w:cs="Times New Roman"/>
+          <w:kern w:val="0"/>
+          <w:lang w:val="en-GB" w:eastAsia="nb-NO"/>
+          <w14:ligatures w14:val="none"/>
+        </w:rPr>
+        <w:t>Due to the length of the output, I will not include the whole console. Below are two screenshots, one showing the beginning, and one showing the end.</w:t>
+      </w:r>
+    </w:p>
+    <w:p>
+      <w:pPr>
+        <w:keepNext/>
+        <w:keepLines/>
+        <w:spacing w:before="360" w:after="120" w:line="360" w:lineRule="auto"/>
+        <w:ind w:left="1080" w:right="360"/>
+        <w:outlineLvl w:val="0"/>
+        <w:rPr>
+          <w:noProof/>
+        </w:rPr>
+      </w:pPr>
+      <w:r>
+        <w:rPr>
+          <w:lang w:val="en-GB" w:eastAsia="nb-NO"/>
+        </w:rPr>
+        <w:drawing>
+          <wp:anchor distT="0" distB="0" distL="114300" distR="114300" simplePos="0" relativeHeight="251661312" behindDoc="0" locked="0" layoutInCell="1" allowOverlap="1" wp14:anchorId="70A3A5C0" wp14:editId="56F5579B">
+            <wp:simplePos x="0" y="0"/>
+            <wp:positionH relativeFrom="column">
+              <wp:posOffset>455444</wp:posOffset>
+            </wp:positionH>
+            <wp:positionV relativeFrom="paragraph">
+              <wp:posOffset>154940</wp:posOffset>
+            </wp:positionV>
+            <wp:extent cx="2485017" cy="3047888"/>
+            <wp:effectExtent l="0" t="0" r="4445" b="635"/>
+            <wp:wrapSquare wrapText="bothSides"/>
+            <wp:docPr id="475767942" name="Bilde 1" descr="Et bilde som inneholder tekst, skjermbilde, programvare, Multimedieprogramvare&#10;&#10;KI-generert innhold kan være feil."/>
+            <wp:cNvGraphicFramePr>
+              <a:graphicFrameLocks xmlns:a="http://schemas.openxmlformats.org/drawingml/2006/main" noChangeAspect="1"/>
+            </wp:cNvGraphicFramePr>
+            <a:graphic xmlns:a="http://schemas.openxmlformats.org/drawingml/2006/main">
+              <a:graphicData uri="http://schemas.openxmlformats.org/drawingml/2006/picture">
+                <pic:pic xmlns:pic="http://schemas.openxmlformats.org/drawingml/2006/picture">
+                  <pic:nvPicPr>
+                    <pic:cNvPr id="475767942" name="Bilde 1" descr="Et bilde som inneholder tekst, skjermbilde, programvare, Multimedieprogramvare&#10;&#10;KI-generert innhold kan være feil."/>
+                    <pic:cNvPicPr/>
+                  </pic:nvPicPr>
+                  <pic:blipFill>
+                    <a:blip r:embed="rId11" cstate="print">
+                      <a:extLst>
+                        <a:ext uri="{28A0092B-C50C-407E-A947-70E740481C1C}">
+                          <a14:useLocalDpi xmlns:a14="http://schemas.microsoft.com/office/drawing/2010/main" val="0"/>
+                        </a:ext>
+                      </a:extLst>
+                    </a:blip>
+                    <a:stretch>
+                      <a:fillRect/>
+                    </a:stretch>
+                  </pic:blipFill>
+                  <pic:spPr>
+                    <a:xfrm>
+                      <a:off x="0" y="0"/>
+                      <a:ext cx="2485017" cy="3047888"/>
+                    </a:xfrm>
+                    <a:prstGeom prst="rect">
+                      <a:avLst/>
+                    </a:prstGeom>
+                  </pic:spPr>
+                </pic:pic>
+              </a:graphicData>
+            </a:graphic>
+            <wp14:sizeRelH relativeFrom="page">
+              <wp14:pctWidth>0</wp14:pctWidth>
+            </wp14:sizeRelH>
+            <wp14:sizeRelV relativeFrom="page">
+              <wp14:pctHeight>0</wp14:pctHeight>
+            </wp14:sizeRelV>
+          </wp:anchor>
+        </w:drawing>
+      </w:r>
+      <w:r>
+        <w:rPr>
+          <w:rFonts w:ascii="Times New Roman" w:eastAsiaTheme="majorEastAsia" w:hAnsi="Times New Roman" w:cs="Times New Roman"/>
+          <w:kern w:val="0"/>
           <w:sz w:val="26"/>
           <w:szCs w:val="26"/>
           <w:lang w:val="en-GB" w:eastAsia="nb-NO"/>
           <w14:ligatures w14:val="none"/>
         </w:rPr>
-      </w:pPr>
-      <w:r>
-        <w:rPr>
-          <w:rFonts w:ascii="Times New Roman" w:eastAsiaTheme="majorEastAsia" w:hAnsi="Times New Roman" w:cs="Times New Roman"/>
-          <w:kern w:val="0"/>
-          <w:sz w:val="26"/>
-          <w:szCs w:val="26"/>
-          <w:lang w:val="en-GB" w:eastAsia="nb-NO"/>
-          <w14:ligatures w14:val="none"/>
-        </w:rPr>
-        <w:t xml:space="preserve">Subtask 1: Run package </w:t>
-      </w:r>
-      <w:proofErr w:type="spellStart"/>
-      <w:r>
-        <w:rPr>
-          <w:rFonts w:ascii="Times New Roman" w:eastAsiaTheme="majorEastAsia" w:hAnsi="Times New Roman" w:cs="Times New Roman"/>
-          <w:i/>
-          <w:iCs/>
-          <w:kern w:val="0"/>
-          <w:sz w:val="26"/>
-          <w:szCs w:val="26"/>
-          <w:lang w:val="en-GB" w:eastAsia="nb-NO"/>
-          <w14:ligatures w14:val="none"/>
-        </w:rPr>
-        <w:t>producerConsumer</w:t>
-      </w:r>
-      <w:proofErr w:type="spellEnd"/>
-      <w:r>
-        <w:rPr>
-          <w:rFonts w:ascii="Times New Roman" w:eastAsiaTheme="majorEastAsia" w:hAnsi="Times New Roman" w:cs="Times New Roman"/>
-          <w:kern w:val="0"/>
-          <w:sz w:val="26"/>
-          <w:szCs w:val="26"/>
-          <w:lang w:val="en-GB" w:eastAsia="nb-NO"/>
-          <w14:ligatures w14:val="none"/>
-        </w:rPr>
-        <w:t xml:space="preserve"> and include output</w:t>
+        <w:drawing>
+          <wp:anchor distT="0" distB="0" distL="114300" distR="114300" simplePos="0" relativeHeight="251662336" behindDoc="0" locked="0" layoutInCell="1" allowOverlap="1" wp14:anchorId="639403EA" wp14:editId="264C44BA">
+            <wp:simplePos x="0" y="0"/>
+            <wp:positionH relativeFrom="column">
+              <wp:posOffset>3220384</wp:posOffset>
+            </wp:positionH>
+            <wp:positionV relativeFrom="paragraph">
+              <wp:posOffset>261</wp:posOffset>
+            </wp:positionV>
+            <wp:extent cx="2656840" cy="3540125"/>
+            <wp:effectExtent l="0" t="0" r="0" b="3175"/>
+            <wp:wrapSquare wrapText="bothSides"/>
+            <wp:docPr id="1403294629" name="Bilde 1" descr="Et bilde som inneholder tekst, skjermbilde, design&#10;&#10;KI-generert innhold kan være feil."/>
+            <wp:cNvGraphicFramePr>
+              <a:graphicFrameLocks xmlns:a="http://schemas.openxmlformats.org/drawingml/2006/main" noChangeAspect="1"/>
+            </wp:cNvGraphicFramePr>
+            <a:graphic xmlns:a="http://schemas.openxmlformats.org/drawingml/2006/main">
+              <a:graphicData uri="http://schemas.openxmlformats.org/drawingml/2006/picture">
+                <pic:pic xmlns:pic="http://schemas.openxmlformats.org/drawingml/2006/picture">
+                  <pic:nvPicPr>
+                    <pic:cNvPr id="1403294629" name="Bilde 1" descr="Et bilde som inneholder tekst, skjermbilde, design&#10;&#10;KI-generert innhold kan være feil."/>
+                    <pic:cNvPicPr/>
+                  </pic:nvPicPr>
+                  <pic:blipFill>
+                    <a:blip r:embed="rId12" cstate="print">
+                      <a:extLst>
+                        <a:ext uri="{28A0092B-C50C-407E-A947-70E740481C1C}">
+                          <a14:useLocalDpi xmlns:a14="http://schemas.microsoft.com/office/drawing/2010/main" val="0"/>
+                        </a:ext>
+                      </a:extLst>
+                    </a:blip>
+                    <a:stretch>
+                      <a:fillRect/>
+                    </a:stretch>
+                  </pic:blipFill>
+                  <pic:spPr>
+                    <a:xfrm>
+                      <a:off x="0" y="0"/>
+                      <a:ext cx="2656840" cy="3540125"/>
+                    </a:xfrm>
+                    <a:prstGeom prst="rect">
+                      <a:avLst/>
+                    </a:prstGeom>
+                  </pic:spPr>
+                </pic:pic>
+              </a:graphicData>
+            </a:graphic>
+            <wp14:sizeRelH relativeFrom="page">
+              <wp14:pctWidth>0</wp14:pctWidth>
+            </wp14:sizeRelH>
+            <wp14:sizeRelV relativeFrom="page">
+              <wp14:pctHeight>0</wp14:pctHeight>
+            </wp14:sizeRelV>
+          </wp:anchor>
+        </w:drawing>
+      </w:r>
+      <w:r>
+        <w:rPr>
+          <w:noProof/>
+        </w:rPr>
+        <w:t xml:space="preserve"> </w:t>
+      </w:r>
+    </w:p>
+    <w:p>
+      <w:pPr>
+        <w:rPr>
+          <w:noProof/>
+        </w:rPr>
+      </w:pPr>
+      <w:r>
+        <w:rPr>
+          <w:noProof/>
+        </w:rPr>
+        <w:br w:type="page"/>
       </w:r>
     </w:p>
     <w:p>
@@ -880,22 +1110,140 @@
         <w:rPr>
           <w:rFonts w:ascii="Times New Roman" w:eastAsiaTheme="majorEastAsia" w:hAnsi="Times New Roman" w:cs="Times New Roman"/>
           <w:kern w:val="0"/>
-          <w:sz w:val="26"/>
-          <w:szCs w:val="26"/>
-          <w:lang w:val="en-GB" w:eastAsia="nb-NO"/>
-          <w14:ligatures w14:val="none"/>
-        </w:rPr>
-      </w:pPr>
-      <w:r>
-        <w:rPr>
-          <w:rFonts w:ascii="Times New Roman" w:eastAsiaTheme="majorEastAsia" w:hAnsi="Times New Roman" w:cs="Times New Roman"/>
-          <w:kern w:val="0"/>
-          <w:sz w:val="26"/>
-          <w:szCs w:val="26"/>
-          <w:lang w:val="en-GB" w:eastAsia="nb-NO"/>
-          <w14:ligatures w14:val="none"/>
-        </w:rPr>
+          <w:sz w:val="28"/>
+          <w:szCs w:val="28"/>
+          <w:u w:val="single"/>
+          <w:lang w:val="en-GB" w:eastAsia="nb-NO"/>
+          <w14:ligatures w14:val="none"/>
+        </w:rPr>
+      </w:pPr>
+      <w:r>
+        <w:rPr>
+          <w:rFonts w:ascii="Times New Roman" w:eastAsiaTheme="majorEastAsia" w:hAnsi="Times New Roman" w:cs="Times New Roman"/>
+          <w:kern w:val="0"/>
+          <w:sz w:val="28"/>
+          <w:szCs w:val="28"/>
+          <w:u w:val="single"/>
+          <w:lang w:val="en-GB" w:eastAsia="nb-NO"/>
+          <w14:ligatures w14:val="none"/>
+        </w:rPr>
+        <w:lastRenderedPageBreak/>
         <w:t>Subtask 2: Which synchronization mechanism(s) and method(s) are used to synchronize the Producer thread and the Consumer thread in this package?</w:t>
+      </w:r>
+    </w:p>
+    <w:p>
+      <w:pPr>
+        <w:pStyle w:val="Listeavsnitt"/>
+        <w:keepNext/>
+        <w:keepLines/>
+        <w:numPr>
+          <w:ilvl w:val="1"/>
+          <w:numId w:val="14"/>
+        </w:numPr>
+        <w:spacing w:before="360" w:after="120" w:line="360" w:lineRule="auto"/>
+        <w:ind w:right="360"/>
+        <w:outlineLvl w:val="0"/>
+        <w:rPr>
+          <w:rFonts w:ascii="Times New Roman" w:eastAsiaTheme="majorEastAsia" w:hAnsi="Times New Roman" w:cs="Times New Roman"/>
+          <w:kern w:val="0"/>
+          <w:sz w:val="28"/>
+          <w:szCs w:val="28"/>
+          <w:u w:val="single"/>
+          <w:lang w:val="en-GB" w:eastAsia="nb-NO"/>
+          <w14:ligatures w14:val="none"/>
+        </w:rPr>
+      </w:pPr>
+      <w:r>
+        <w:rPr>
+          <w:rFonts w:ascii="Times New Roman" w:eastAsiaTheme="majorEastAsia" w:hAnsi="Times New Roman" w:cs="Times New Roman"/>
+          <w:kern w:val="0"/>
+          <w:sz w:val="28"/>
+          <w:szCs w:val="28"/>
+          <w:lang w:val="en-GB" w:eastAsia="nb-NO"/>
+          <w14:ligatures w14:val="none"/>
+        </w:rPr>
+        <w:t>Consumer</w:t>
+      </w:r>
+      <w:r>
+        <w:rPr>
+          <w:rFonts w:ascii="Times New Roman" w:eastAsiaTheme="majorEastAsia" w:hAnsi="Times New Roman" w:cs="Times New Roman"/>
+          <w:kern w:val="0"/>
+          <w:sz w:val="28"/>
+          <w:szCs w:val="28"/>
+          <w:lang w:val="en-GB" w:eastAsia="nb-NO"/>
+          <w14:ligatures w14:val="none"/>
+        </w:rPr>
+        <w:t xml:space="preserve"> and Producer are </w:t>
+      </w:r>
+      <w:r>
+        <w:rPr>
+          <w:rFonts w:ascii="Times New Roman" w:eastAsiaTheme="majorEastAsia" w:hAnsi="Times New Roman" w:cs="Times New Roman"/>
+          <w:kern w:val="0"/>
+          <w:sz w:val="28"/>
+          <w:szCs w:val="28"/>
+          <w:lang w:val="en-GB" w:eastAsia="nb-NO"/>
+          <w14:ligatures w14:val="none"/>
+        </w:rPr>
+        <w:t>utilizing a queue buffer</w:t>
+      </w:r>
+      <w:r>
+        <w:rPr>
+          <w:rFonts w:ascii="Times New Roman" w:eastAsiaTheme="majorEastAsia" w:hAnsi="Times New Roman" w:cs="Times New Roman"/>
+          <w:kern w:val="0"/>
+          <w:sz w:val="28"/>
+          <w:szCs w:val="28"/>
+          <w:lang w:val="en-GB" w:eastAsia="nb-NO"/>
+          <w14:ligatures w14:val="none"/>
+        </w:rPr>
+        <w:t xml:space="preserve"> class which declare methods such as </w:t>
+      </w:r>
+      <w:r>
+        <w:rPr>
+          <w:rFonts w:ascii="Times New Roman" w:eastAsiaTheme="majorEastAsia" w:hAnsi="Times New Roman" w:cs="Times New Roman"/>
+          <w:i/>
+          <w:iCs/>
+          <w:kern w:val="0"/>
+          <w:sz w:val="28"/>
+          <w:szCs w:val="28"/>
+          <w:lang w:val="en-GB" w:eastAsia="nb-NO"/>
+          <w14:ligatures w14:val="none"/>
+        </w:rPr>
+        <w:t>put</w:t>
+      </w:r>
+      <w:r>
+        <w:rPr>
+          <w:rFonts w:ascii="Times New Roman" w:eastAsiaTheme="majorEastAsia" w:hAnsi="Times New Roman" w:cs="Times New Roman"/>
+          <w:kern w:val="0"/>
+          <w:sz w:val="28"/>
+          <w:szCs w:val="28"/>
+          <w:lang w:val="en-GB" w:eastAsia="nb-NO"/>
+          <w14:ligatures w14:val="none"/>
+        </w:rPr>
+        <w:t xml:space="preserve"> and </w:t>
+      </w:r>
+      <w:r>
+        <w:rPr>
+          <w:rFonts w:ascii="Times New Roman" w:eastAsiaTheme="majorEastAsia" w:hAnsi="Times New Roman" w:cs="Times New Roman"/>
+          <w:i/>
+          <w:iCs/>
+          <w:kern w:val="0"/>
+          <w:sz w:val="28"/>
+          <w:szCs w:val="28"/>
+          <w:lang w:val="en-GB" w:eastAsia="nb-NO"/>
+          <w14:ligatures w14:val="none"/>
+        </w:rPr>
+        <w:t>remove</w:t>
+      </w:r>
+      <w:r>
+        <w:rPr>
+          <w:rFonts w:ascii="Times New Roman" w:eastAsiaTheme="majorEastAsia" w:hAnsi="Times New Roman" w:cs="Times New Roman"/>
+          <w:kern w:val="0"/>
+          <w:sz w:val="28"/>
+          <w:szCs w:val="28"/>
+          <w:lang w:val="en-GB" w:eastAsia="nb-NO"/>
+          <w14:ligatures w14:val="none"/>
+        </w:rPr>
+        <w:t xml:space="preserve"> which are both synchronized.</w:t>
       </w:r>
     </w:p>
     <w:p>
@@ -913,18 +1261,20 @@
         <w:rPr>
           <w:rFonts w:ascii="Times New Roman" w:eastAsiaTheme="majorEastAsia" w:hAnsi="Times New Roman" w:cs="Times New Roman"/>
           <w:kern w:val="0"/>
-          <w:sz w:val="26"/>
-          <w:szCs w:val="26"/>
-          <w:lang w:val="en-GB" w:eastAsia="nb-NO"/>
-          <w14:ligatures w14:val="none"/>
-        </w:rPr>
-      </w:pPr>
-      <w:r>
-        <w:rPr>
-          <w:rFonts w:ascii="Times New Roman" w:eastAsiaTheme="majorEastAsia" w:hAnsi="Times New Roman" w:cs="Times New Roman"/>
-          <w:kern w:val="0"/>
-          <w:sz w:val="26"/>
-          <w:szCs w:val="26"/>
+          <w:sz w:val="28"/>
+          <w:szCs w:val="28"/>
+          <w:u w:val="single"/>
+          <w:lang w:val="en-GB" w:eastAsia="nb-NO"/>
+          <w14:ligatures w14:val="none"/>
+        </w:rPr>
+      </w:pPr>
+      <w:r>
+        <w:rPr>
+          <w:rFonts w:ascii="Times New Roman" w:eastAsiaTheme="majorEastAsia" w:hAnsi="Times New Roman" w:cs="Times New Roman"/>
+          <w:kern w:val="0"/>
+          <w:sz w:val="28"/>
+          <w:szCs w:val="28"/>
+          <w:u w:val="single"/>
           <w:lang w:val="en-GB" w:eastAsia="nb-NO"/>
           <w14:ligatures w14:val="none"/>
         </w:rPr>
@@ -933,8 +1283,9 @@
       <w:r>
         <w:rPr>
           <w:rFonts w:ascii="Times New Roman" w:hAnsi="Times New Roman" w:cs="Times New Roman"/>
-          <w:sz w:val="26"/>
-          <w:szCs w:val="26"/>
+          <w:sz w:val="28"/>
+          <w:szCs w:val="28"/>
+          <w:u w:val="single"/>
           <w:lang w:val="en-GB"/>
         </w:rPr>
         <w:t xml:space="preserve"> </w:t>
@@ -943,8 +1294,9 @@
         <w:rPr>
           <w:rFonts w:ascii="Times New Roman" w:eastAsiaTheme="majorEastAsia" w:hAnsi="Times New Roman" w:cs="Times New Roman"/>
           <w:kern w:val="0"/>
-          <w:sz w:val="26"/>
-          <w:szCs w:val="26"/>
+          <w:sz w:val="28"/>
+          <w:szCs w:val="28"/>
+          <w:u w:val="single"/>
           <w:lang w:val="en-GB" w:eastAsia="nb-NO"/>
           <w14:ligatures w14:val="none"/>
         </w:rPr>
@@ -1013,7 +1365,6 @@
           <w:lang w:val="en-GB" w:eastAsia="nb-NO"/>
           <w14:ligatures w14:val="none"/>
         </w:rPr>
-        <w:lastRenderedPageBreak/>
         <w:t>Subtask 1: Explain why data race occurs</w:t>
       </w:r>
     </w:p>
@@ -1356,6 +1707,8 @@
       </w:pPr>
     </w:p>
     <w:sectPr>
+      <w:headerReference w:type="even" r:id="rId13"/>
+      <w:headerReference w:type="default" r:id="rId14"/>
       <w:pgSz w:w="11906" w:h="16838"/>
       <w:pgMar w:top="1417" w:right="1417" w:bottom="1417" w:left="1417" w:header="708" w:footer="708" w:gutter="0"/>
       <w:cols w:space="708"/>
@@ -1363,6 +1716,179 @@
     </w:sectPr>
   </w:body>
 </w:document>
+</file>
+
+<file path=word/endnotes.xml><?xml version="1.0" encoding="utf-8"?>
+<w:endnotes xmlns:wpc="http://schemas.microsoft.com/office/word/2010/wordprocessingCanvas" xmlns:cx="http://schemas.microsoft.com/office/drawing/2014/chartex" xmlns:cx1="http://schemas.microsoft.com/office/drawing/2015/9/8/chartex" xmlns:cx2="http://schemas.microsoft.com/office/drawing/2015/10/21/chartex" xmlns:cx3="http://schemas.microsoft.com/office/drawing/2016/5/9/chartex" xmlns:cx4="http://schemas.microsoft.com/office/drawing/2016/5/10/chartex" xmlns:cx5="http://schemas.microsoft.com/office/drawing/2016/5/11/chartex" xmlns:cx6="http://schemas.microsoft.com/office/drawing/2016/5/12/chartex" xmlns:cx7="http://schemas.microsoft.com/office/drawing/2016/5/13/chartex" xmlns:cx8="http://schemas.microsoft.com/office/drawing/2016/5/14/chartex" xmlns:mc="http://schemas.openxmlformats.org/markup-compatibility/2006" xmlns:aink="http://schemas.microsoft.com/office/drawing/2016/ink" xmlns:am3d="http://schemas.microsoft.com/office/drawing/2017/model3d" xmlns:o="urn:schemas-microsoft-com:office:office" xmlns:oel="http://schemas.microsoft.com/office/2019/extlst" xmlns:r="http://schemas.openxmlformats.org/officeDocument/2006/relationships" xmlns:m="http://schemas.openxmlformats.org/officeDocument/2006/math" xmlns:v="urn:schemas-microsoft-com:vml" xmlns:wp14="http://schemas.microsoft.com/office/word/2010/wordprocessingDrawing" xmlns:wp="http://schemas.openxmlformats.org/drawingml/2006/wordprocessingDrawing" xmlns:w10="urn:schemas-microsoft-com:office:word" xmlns:w="http://schemas.openxmlformats.org/wordprocessingml/2006/main" xmlns:w14="http://schemas.microsoft.com/office/word/2010/wordml" xmlns:w15="http://schemas.microsoft.com/office/word/2012/wordml" xmlns:w16cex="http://schemas.microsoft.com/office/word/2018/wordml/cex" xmlns:w16cid="http://schemas.microsoft.com/office/word/2016/wordml/cid" xmlns:w16="http://schemas.microsoft.com/office/word/2018/wordml" xmlns:w16du="http://schemas.microsoft.com/office/word/2023/wordml/word16du" xmlns:w16sdtdh="http://schemas.microsoft.com/office/word/2020/wordml/sdtdatahash" xmlns:w16sdtfl="http://schemas.microsoft.com/office/word/2024/wordml/sdtformatlock" xmlns:w16se="http://schemas.microsoft.com/office/word/2015/wordml/symex" xmlns:wpg="http://schemas.microsoft.com/office/word/2010/wordprocessingGroup" xmlns:wpi="http://schemas.microsoft.com/office/word/2010/wordprocessingInk" xmlns:wne="http://schemas.microsoft.com/office/word/2006/wordml" xmlns:wps="http://schemas.microsoft.com/office/word/2010/wordprocessingShape" mc:Ignorable="w14 w15 w16se w16cid w16 w16cex w16sdtdh w16sdtfl w16du wp14">
+  <w:endnote w:type="separator" w:id="-1">
+    <w:p>
+      <w:pPr>
+        <w:spacing w:after="0" w:line="240" w:lineRule="auto"/>
+      </w:pPr>
+      <w:r>
+        <w:separator/>
+      </w:r>
+    </w:p>
+  </w:endnote>
+  <w:endnote w:type="continuationSeparator" w:id="0">
+    <w:p>
+      <w:pPr>
+        <w:spacing w:after="0" w:line="240" w:lineRule="auto"/>
+      </w:pPr>
+      <w:r>
+        <w:continuationSeparator/>
+      </w:r>
+    </w:p>
+  </w:endnote>
+</w:endnotes>
+</file>
+
+<file path=word/footnotes.xml><?xml version="1.0" encoding="utf-8"?>
+<w:footnotes xmlns:wpc="http://schemas.microsoft.com/office/word/2010/wordprocessingCanvas" xmlns:cx="http://schemas.microsoft.com/office/drawing/2014/chartex" xmlns:cx1="http://schemas.microsoft.com/office/drawing/2015/9/8/chartex" xmlns:cx2="http://schemas.microsoft.com/office/drawing/2015/10/21/chartex" xmlns:cx3="http://schemas.microsoft.com/office/drawing/2016/5/9/chartex" xmlns:cx4="http://schemas.microsoft.com/office/drawing/2016/5/10/chartex" xmlns:cx5="http://schemas.microsoft.com/office/drawing/2016/5/11/chartex" xmlns:cx6="http://schemas.microsoft.com/office/drawing/2016/5/12/chartex" xmlns:cx7="http://schemas.microsoft.com/office/drawing/2016/5/13/chartex" xmlns:cx8="http://schemas.microsoft.com/office/drawing/2016/5/14/chartex" xmlns:mc="http://schemas.openxmlformats.org/markup-compatibility/2006" xmlns:aink="http://schemas.microsoft.com/office/drawing/2016/ink" xmlns:am3d="http://schemas.microsoft.com/office/drawing/2017/model3d" xmlns:o="urn:schemas-microsoft-com:office:office" xmlns:oel="http://schemas.microsoft.com/office/2019/extlst" xmlns:r="http://schemas.openxmlformats.org/officeDocument/2006/relationships" xmlns:m="http://schemas.openxmlformats.org/officeDocument/2006/math" xmlns:v="urn:schemas-microsoft-com:vml" xmlns:wp14="http://schemas.microsoft.com/office/word/2010/wordprocessingDrawing" xmlns:wp="http://schemas.openxmlformats.org/drawingml/2006/wordprocessingDrawing" xmlns:w10="urn:schemas-microsoft-com:office:word" xmlns:w="http://schemas.openxmlformats.org/wordprocessingml/2006/main" xmlns:w14="http://schemas.microsoft.com/office/word/2010/wordml" xmlns:w15="http://schemas.microsoft.com/office/word/2012/wordml" xmlns:w16cex="http://schemas.microsoft.com/office/word/2018/wordml/cex" xmlns:w16cid="http://schemas.microsoft.com/office/word/2016/wordml/cid" xmlns:w16="http://schemas.microsoft.com/office/word/2018/wordml" xmlns:w16du="http://schemas.microsoft.com/office/word/2023/wordml/word16du" xmlns:w16sdtdh="http://schemas.microsoft.com/office/word/2020/wordml/sdtdatahash" xmlns:w16sdtfl="http://schemas.microsoft.com/office/word/2024/wordml/sdtformatlock" xmlns:w16se="http://schemas.microsoft.com/office/word/2015/wordml/symex" xmlns:wpg="http://schemas.microsoft.com/office/word/2010/wordprocessingGroup" xmlns:wpi="http://schemas.microsoft.com/office/word/2010/wordprocessingInk" xmlns:wne="http://schemas.microsoft.com/office/word/2006/wordml" xmlns:wps="http://schemas.microsoft.com/office/word/2010/wordprocessingShape" mc:Ignorable="w14 w15 w16se w16cid w16 w16cex w16sdtdh w16sdtfl w16du wp14">
+  <w:footnote w:type="separator" w:id="-1">
+    <w:p>
+      <w:pPr>
+        <w:spacing w:after="0" w:line="240" w:lineRule="auto"/>
+      </w:pPr>
+      <w:r>
+        <w:separator/>
+      </w:r>
+    </w:p>
+  </w:footnote>
+  <w:footnote w:type="continuationSeparator" w:id="0">
+    <w:p>
+      <w:pPr>
+        <w:spacing w:after="0" w:line="240" w:lineRule="auto"/>
+      </w:pPr>
+      <w:r>
+        <w:continuationSeparator/>
+      </w:r>
+    </w:p>
+  </w:footnote>
+</w:footnotes>
+</file>
+
+<file path=word/header1.xml><?xml version="1.0" encoding="utf-8"?>
+<w:hdr xmlns:wpc="http://schemas.microsoft.com/office/word/2010/wordprocessingCanvas" xmlns:cx="http://schemas.microsoft.com/office/drawing/2014/chartex" xmlns:cx1="http://schemas.microsoft.com/office/drawing/2015/9/8/chartex" xmlns:cx2="http://schemas.microsoft.com/office/drawing/2015/10/21/chartex" xmlns:cx3="http://schemas.microsoft.com/office/drawing/2016/5/9/chartex" xmlns:cx4="http://schemas.microsoft.com/office/drawing/2016/5/10/chartex" xmlns:cx5="http://schemas.microsoft.com/office/drawing/2016/5/11/chartex" xmlns:cx6="http://schemas.microsoft.com/office/drawing/2016/5/12/chartex" xmlns:cx7="http://schemas.microsoft.com/office/drawing/2016/5/13/chartex" xmlns:cx8="http://schemas.microsoft.com/office/drawing/2016/5/14/chartex" xmlns:mc="http://schemas.openxmlformats.org/markup-compatibility/2006" xmlns:aink="http://schemas.microsoft.com/office/drawing/2016/ink" xmlns:am3d="http://schemas.microsoft.com/office/drawing/2017/model3d" xmlns:o="urn:schemas-microsoft-com:office:office" xmlns:oel="http://schemas.microsoft.com/office/2019/extlst" xmlns:r="http://schemas.openxmlformats.org/officeDocument/2006/relationships" xmlns:m="http://schemas.openxmlformats.org/officeDocument/2006/math" xmlns:v="urn:schemas-microsoft-com:vml" xmlns:wp14="http://schemas.microsoft.com/office/word/2010/wordprocessingDrawing" xmlns:wp="http://schemas.openxmlformats.org/drawingml/2006/wordprocessingDrawing" xmlns:w10="urn:schemas-microsoft-com:office:word" xmlns:w="http://schemas.openxmlformats.org/wordprocessingml/2006/main" xmlns:w14="http://schemas.microsoft.com/office/word/2010/wordml" xmlns:w15="http://schemas.microsoft.com/office/word/2012/wordml" xmlns:w16cex="http://schemas.microsoft.com/office/word/2018/wordml/cex" xmlns:w16cid="http://schemas.microsoft.com/office/word/2016/wordml/cid" xmlns:w16="http://schemas.microsoft.com/office/word/2018/wordml" xmlns:w16du="http://schemas.microsoft.com/office/word/2023/wordml/word16du" xmlns:w16sdtdh="http://schemas.microsoft.com/office/word/2020/wordml/sdtdatahash" xmlns:w16sdtfl="http://schemas.microsoft.com/office/word/2024/wordml/sdtformatlock" xmlns:w16se="http://schemas.microsoft.com/office/word/2015/wordml/symex" xmlns:wpg="http://schemas.microsoft.com/office/word/2010/wordprocessingGroup" xmlns:wpi="http://schemas.microsoft.com/office/word/2010/wordprocessingInk" xmlns:wne="http://schemas.microsoft.com/office/word/2006/wordml" xmlns:wps="http://schemas.microsoft.com/office/word/2010/wordprocessingShape" mc:Ignorable="w14 w15 w16se w16cid w16 w16cex w16sdtdh w16sdtfl w16du wp14">
+  <w:sdt>
+    <w:sdtPr>
+      <w:rPr>
+        <w:rStyle w:val="Sidetall"/>
+      </w:rPr>
+      <w:id w:val="755255775"/>
+      <w:docPartObj>
+        <w:docPartGallery w:val="Page Numbers (Top of Page)"/>
+        <w:docPartUnique/>
+      </w:docPartObj>
+    </w:sdtPr>
+    <w:sdtContent>
+      <w:p>
+        <w:pPr>
+          <w:pStyle w:val="Topptekst"/>
+          <w:framePr w:wrap="none" w:vAnchor="text" w:hAnchor="margin" w:xAlign="right" w:y="1"/>
+          <w:rPr>
+            <w:rStyle w:val="Sidetall"/>
+          </w:rPr>
+        </w:pPr>
+        <w:r>
+          <w:rPr>
+            <w:rStyle w:val="Sidetall"/>
+          </w:rPr>
+          <w:fldChar w:fldCharType="begin"/>
+        </w:r>
+        <w:r>
+          <w:rPr>
+            <w:rStyle w:val="Sidetall"/>
+          </w:rPr>
+          <w:instrText xml:space="preserve"> PAGE </w:instrText>
+        </w:r>
+        <w:r>
+          <w:rPr>
+            <w:rStyle w:val="Sidetall"/>
+          </w:rPr>
+          <w:fldChar w:fldCharType="separate"/>
+        </w:r>
+        <w:r>
+          <w:rPr>
+            <w:rStyle w:val="Sidetall"/>
+          </w:rPr>
+          <w:fldChar w:fldCharType="end"/>
+        </w:r>
+      </w:p>
+    </w:sdtContent>
+  </w:sdt>
+  <w:p>
+    <w:pPr>
+      <w:pStyle w:val="Topptekst"/>
+      <w:ind w:right="360"/>
+    </w:pPr>
+  </w:p>
+</w:hdr>
+</file>
+
+<file path=word/header2.xml><?xml version="1.0" encoding="utf-8"?>
+<w:hdr xmlns:wpc="http://schemas.microsoft.com/office/word/2010/wordprocessingCanvas" xmlns:cx="http://schemas.microsoft.com/office/drawing/2014/chartex" xmlns:cx1="http://schemas.microsoft.com/office/drawing/2015/9/8/chartex" xmlns:cx2="http://schemas.microsoft.com/office/drawing/2015/10/21/chartex" xmlns:cx3="http://schemas.microsoft.com/office/drawing/2016/5/9/chartex" xmlns:cx4="http://schemas.microsoft.com/office/drawing/2016/5/10/chartex" xmlns:cx5="http://schemas.microsoft.com/office/drawing/2016/5/11/chartex" xmlns:cx6="http://schemas.microsoft.com/office/drawing/2016/5/12/chartex" xmlns:cx7="http://schemas.microsoft.com/office/drawing/2016/5/13/chartex" xmlns:cx8="http://schemas.microsoft.com/office/drawing/2016/5/14/chartex" xmlns:mc="http://schemas.openxmlformats.org/markup-compatibility/2006" xmlns:aink="http://schemas.microsoft.com/office/drawing/2016/ink" xmlns:am3d="http://schemas.microsoft.com/office/drawing/2017/model3d" xmlns:o="urn:schemas-microsoft-com:office:office" xmlns:oel="http://schemas.microsoft.com/office/2019/extlst" xmlns:r="http://schemas.openxmlformats.org/officeDocument/2006/relationships" xmlns:m="http://schemas.openxmlformats.org/officeDocument/2006/math" xmlns:v="urn:schemas-microsoft-com:vml" xmlns:wp14="http://schemas.microsoft.com/office/word/2010/wordprocessingDrawing" xmlns:wp="http://schemas.openxmlformats.org/drawingml/2006/wordprocessingDrawing" xmlns:w10="urn:schemas-microsoft-com:office:word" xmlns:w="http://schemas.openxmlformats.org/wordprocessingml/2006/main" xmlns:w14="http://schemas.microsoft.com/office/word/2010/wordml" xmlns:w15="http://schemas.microsoft.com/office/word/2012/wordml" xmlns:w16cex="http://schemas.microsoft.com/office/word/2018/wordml/cex" xmlns:w16cid="http://schemas.microsoft.com/office/word/2016/wordml/cid" xmlns:w16="http://schemas.microsoft.com/office/word/2018/wordml" xmlns:w16du="http://schemas.microsoft.com/office/word/2023/wordml/word16du" xmlns:w16sdtdh="http://schemas.microsoft.com/office/word/2020/wordml/sdtdatahash" xmlns:w16sdtfl="http://schemas.microsoft.com/office/word/2024/wordml/sdtformatlock" xmlns:w16se="http://schemas.microsoft.com/office/word/2015/wordml/symex" xmlns:wpg="http://schemas.microsoft.com/office/word/2010/wordprocessingGroup" xmlns:wpi="http://schemas.microsoft.com/office/word/2010/wordprocessingInk" xmlns:wne="http://schemas.microsoft.com/office/word/2006/wordml" xmlns:wps="http://schemas.microsoft.com/office/word/2010/wordprocessingShape" mc:Ignorable="w14 w15 w16se w16cid w16 w16cex w16sdtdh w16sdtfl w16du wp14">
+  <w:sdt>
+    <w:sdtPr>
+      <w:rPr>
+        <w:rStyle w:val="Sidetall"/>
+      </w:rPr>
+      <w:id w:val="609167015"/>
+      <w:docPartObj>
+        <w:docPartGallery w:val="Page Numbers (Top of Page)"/>
+        <w:docPartUnique/>
+      </w:docPartObj>
+    </w:sdtPr>
+    <w:sdtContent>
+      <w:p>
+        <w:pPr>
+          <w:pStyle w:val="Topptekst"/>
+          <w:framePr w:wrap="none" w:vAnchor="text" w:hAnchor="margin" w:xAlign="right" w:y="1"/>
+          <w:rPr>
+            <w:rStyle w:val="Sidetall"/>
+          </w:rPr>
+        </w:pPr>
+        <w:r>
+          <w:rPr>
+            <w:rStyle w:val="Sidetall"/>
+          </w:rPr>
+          <w:fldChar w:fldCharType="begin"/>
+        </w:r>
+        <w:r>
+          <w:rPr>
+            <w:rStyle w:val="Sidetall"/>
+          </w:rPr>
+          <w:instrText xml:space="preserve"> PAGE </w:instrText>
+        </w:r>
+        <w:r>
+          <w:rPr>
+            <w:rStyle w:val="Sidetall"/>
+          </w:rPr>
+          <w:fldChar w:fldCharType="separate"/>
+        </w:r>
+        <w:r>
+          <w:rPr>
+            <w:rStyle w:val="Sidetall"/>
+            <w:noProof/>
+          </w:rPr>
+          <w:t>1</w:t>
+        </w:r>
+        <w:r>
+          <w:rPr>
+            <w:rStyle w:val="Sidetall"/>
+          </w:rPr>
+          <w:fldChar w:fldCharType="end"/>
+        </w:r>
+      </w:p>
+    </w:sdtContent>
+  </w:sdt>
+  <w:p>
+    <w:pPr>
+      <w:pStyle w:val="Topptekst"/>
+      <w:ind w:right="360"/>
+    </w:pPr>
+  </w:p>
+</w:hdr>
 </file>
 
 <file path=word/numbering.xml><?xml version="1.0" encoding="utf-8"?>
@@ -3501,6 +4027,36 @@
       <w:spacing w:val="5"/>
     </w:rPr>
   </w:style>
+  <w:style w:type="paragraph" w:styleId="Topptekst">
+    <w:name w:val="header"/>
+    <w:basedOn w:val="Normal"/>
+    <w:link w:val="TopptekstTegn"/>
+    <w:uiPriority w:val="99"/>
+    <w:unhideWhenUsed/>
+    <w:rsid w:val="0008191A"/>
+    <w:pPr>
+      <w:tabs>
+        <w:tab w:val="center" w:pos="4536"/>
+        <w:tab w:val="right" w:pos="9072"/>
+      </w:tabs>
+      <w:spacing w:after="0" w:line="240" w:lineRule="auto"/>
+    </w:pPr>
+  </w:style>
+  <w:style w:type="character" w:customStyle="1" w:styleId="TopptekstTegn">
+    <w:name w:val="Topptekst Tegn"/>
+    <w:basedOn w:val="Standardskriftforavsnitt"/>
+    <w:link w:val="Topptekst"/>
+    <w:uiPriority w:val="99"/>
+    <w:rsid w:val="0008191A"/>
+  </w:style>
+  <w:style w:type="character" w:styleId="Sidetall">
+    <w:name w:val="page number"/>
+    <w:basedOn w:val="Standardskriftforavsnitt"/>
+    <w:uiPriority w:val="99"/>
+    <w:semiHidden/>
+    <w:unhideWhenUsed/>
+    <w:rsid w:val="0008191A"/>
+  </w:style>
 </w:styles>
 </file>
 

</xml_diff>

<commit_message>
lab6: Started on exercise 3
</commit_message>
<xml_diff>
--- a/lab6/lab6_report.docx
+++ b/lab6/lab6_report.docx
@@ -357,7 +357,7 @@
           <w14:ligatures w14:val="none"/>
         </w:rPr>
         <w:drawing>
-          <wp:anchor distT="0" distB="0" distL="114300" distR="114300" simplePos="0" relativeHeight="251658240" behindDoc="0" locked="0" layoutInCell="1" allowOverlap="1" wp14:anchorId="29BDA7FF" wp14:editId="1D2EAC74">
+          <wp:anchor distT="0" distB="0" distL="114300" distR="114300" simplePos="0" relativeHeight="251658240" behindDoc="0" locked="0" layoutInCell="1" allowOverlap="1" wp14:anchorId="29BDA7FF" wp14:editId="64D89BBA">
             <wp:simplePos x="0" y="0"/>
             <wp:positionH relativeFrom="column">
               <wp:posOffset>-465455</wp:posOffset>
@@ -844,8 +844,23 @@
           <w14:ligatures w14:val="none"/>
         </w:rPr>
         <w:lastRenderedPageBreak/>
-        <w:t>Exercise 2: Refer to project lab6</w:t>
-      </w:r>
+        <w:t xml:space="preserve">Exercise 2: </w:t>
+      </w:r>
+      <w:proofErr w:type="spellStart"/>
+      <w:r>
+        <w:rPr>
+          <w:rFonts w:ascii="Times New Roman" w:eastAsiaTheme="majorEastAsia" w:hAnsi="Times New Roman" w:cs="Times New Roman"/>
+          <w:b/>
+          <w:bCs/>
+          <w:kern w:val="0"/>
+          <w:sz w:val="36"/>
+          <w:szCs w:val="36"/>
+          <w:lang w:eastAsia="nb-NO"/>
+          <w14:ligatures w14:val="none"/>
+        </w:rPr>
+        <w:t>producerConsumer</w:t>
+      </w:r>
+      <w:proofErr w:type="spellEnd"/>
     </w:p>
     <w:p>
       <w:pPr>
@@ -952,10 +967,11 @@
       </w:pPr>
       <w:r>
         <w:rPr>
+          <w:noProof/>
           <w:lang w:val="en-GB" w:eastAsia="nb-NO"/>
         </w:rPr>
         <w:drawing>
-          <wp:anchor distT="0" distB="0" distL="114300" distR="114300" simplePos="0" relativeHeight="251661312" behindDoc="0" locked="0" layoutInCell="1" allowOverlap="1" wp14:anchorId="70A3A5C0" wp14:editId="56F5579B">
+          <wp:anchor distT="0" distB="0" distL="114300" distR="114300" simplePos="0" relativeHeight="251661312" behindDoc="0" locked="0" layoutInCell="1" allowOverlap="1" wp14:anchorId="70A3A5C0" wp14:editId="6E203686">
             <wp:simplePos x="0" y="0"/>
             <wp:positionH relativeFrom="column">
               <wp:posOffset>455444</wp:posOffset>
@@ -1013,6 +1029,7 @@
       <w:r>
         <w:rPr>
           <w:rFonts w:ascii="Times New Roman" w:eastAsiaTheme="majorEastAsia" w:hAnsi="Times New Roman" w:cs="Times New Roman"/>
+          <w:noProof/>
           <w:kern w:val="0"/>
           <w:sz w:val="26"/>
           <w:szCs w:val="26"/>
@@ -1020,7 +1037,7 @@
           <w14:ligatures w14:val="none"/>
         </w:rPr>
         <w:drawing>
-          <wp:anchor distT="0" distB="0" distL="114300" distR="114300" simplePos="0" relativeHeight="251662336" behindDoc="0" locked="0" layoutInCell="1" allowOverlap="1" wp14:anchorId="639403EA" wp14:editId="264C44BA">
+          <wp:anchor distT="0" distB="0" distL="114300" distR="114300" simplePos="0" relativeHeight="251662336" behindDoc="0" locked="0" layoutInCell="1" allowOverlap="1" wp14:anchorId="639403EA" wp14:editId="467769BC">
             <wp:simplePos x="0" y="0"/>
             <wp:positionH relativeFrom="column">
               <wp:posOffset>3220384</wp:posOffset>
@@ -1134,116 +1151,88 @@
     <w:p>
       <w:pPr>
         <w:pStyle w:val="Listeavsnitt"/>
-        <w:keepNext/>
-        <w:keepLines/>
         <w:numPr>
           <w:ilvl w:val="1"/>
           <w:numId w:val="14"/>
         </w:numPr>
-        <w:spacing w:before="360" w:after="120" w:line="360" w:lineRule="auto"/>
-        <w:ind w:right="360"/>
-        <w:outlineLvl w:val="0"/>
-        <w:rPr>
-          <w:rFonts w:ascii="Times New Roman" w:eastAsiaTheme="majorEastAsia" w:hAnsi="Times New Roman" w:cs="Times New Roman"/>
-          <w:kern w:val="0"/>
-          <w:sz w:val="28"/>
-          <w:szCs w:val="28"/>
+        <w:rPr>
+          <w:rFonts w:ascii="Times New Roman" w:hAnsi="Times New Roman" w:cs="Times New Roman"/>
           <w:u w:val="single"/>
           <w:lang w:val="en-GB" w:eastAsia="nb-NO"/>
-          <w14:ligatures w14:val="none"/>
-        </w:rPr>
-      </w:pPr>
-      <w:r>
-        <w:rPr>
-          <w:rFonts w:ascii="Times New Roman" w:eastAsiaTheme="majorEastAsia" w:hAnsi="Times New Roman" w:cs="Times New Roman"/>
-          <w:kern w:val="0"/>
-          <w:sz w:val="28"/>
-          <w:szCs w:val="28"/>
-          <w:lang w:val="en-GB" w:eastAsia="nb-NO"/>
-          <w14:ligatures w14:val="none"/>
+        </w:rPr>
+      </w:pPr>
+      <w:r>
+        <w:rPr>
+          <w:rFonts w:ascii="Times New Roman" w:hAnsi="Times New Roman" w:cs="Times New Roman"/>
+          <w:lang w:val="en-GB" w:eastAsia="nb-NO"/>
         </w:rPr>
         <w:t>Consumer</w:t>
       </w:r>
       <w:r>
         <w:rPr>
-          <w:rFonts w:ascii="Times New Roman" w:eastAsiaTheme="majorEastAsia" w:hAnsi="Times New Roman" w:cs="Times New Roman"/>
-          <w:kern w:val="0"/>
-          <w:sz w:val="28"/>
-          <w:szCs w:val="28"/>
-          <w:lang w:val="en-GB" w:eastAsia="nb-NO"/>
-          <w14:ligatures w14:val="none"/>
+          <w:rFonts w:ascii="Times New Roman" w:hAnsi="Times New Roman" w:cs="Times New Roman"/>
+          <w:lang w:val="en-GB" w:eastAsia="nb-NO"/>
         </w:rPr>
         <w:t xml:space="preserve"> and Producer are </w:t>
       </w:r>
       <w:r>
         <w:rPr>
-          <w:rFonts w:ascii="Times New Roman" w:eastAsiaTheme="majorEastAsia" w:hAnsi="Times New Roman" w:cs="Times New Roman"/>
-          <w:kern w:val="0"/>
-          <w:sz w:val="28"/>
-          <w:szCs w:val="28"/>
-          <w:lang w:val="en-GB" w:eastAsia="nb-NO"/>
-          <w14:ligatures w14:val="none"/>
+          <w:rFonts w:ascii="Times New Roman" w:hAnsi="Times New Roman" w:cs="Times New Roman"/>
+          <w:lang w:val="en-GB" w:eastAsia="nb-NO"/>
         </w:rPr>
         <w:t>utilizing a queue buffer</w:t>
       </w:r>
       <w:r>
         <w:rPr>
-          <w:rFonts w:ascii="Times New Roman" w:eastAsiaTheme="majorEastAsia" w:hAnsi="Times New Roman" w:cs="Times New Roman"/>
-          <w:kern w:val="0"/>
-          <w:sz w:val="28"/>
-          <w:szCs w:val="28"/>
-          <w:lang w:val="en-GB" w:eastAsia="nb-NO"/>
-          <w14:ligatures w14:val="none"/>
+          <w:rFonts w:ascii="Times New Roman" w:hAnsi="Times New Roman" w:cs="Times New Roman"/>
+          <w:lang w:val="en-GB" w:eastAsia="nb-NO"/>
         </w:rPr>
         <w:t xml:space="preserve"> class which declare methods such as </w:t>
       </w:r>
       <w:r>
         <w:rPr>
-          <w:rFonts w:ascii="Times New Roman" w:eastAsiaTheme="majorEastAsia" w:hAnsi="Times New Roman" w:cs="Times New Roman"/>
+          <w:rFonts w:ascii="Times New Roman" w:hAnsi="Times New Roman" w:cs="Times New Roman"/>
           <w:i/>
           <w:iCs/>
-          <w:kern w:val="0"/>
-          <w:sz w:val="28"/>
-          <w:szCs w:val="28"/>
-          <w:lang w:val="en-GB" w:eastAsia="nb-NO"/>
-          <w14:ligatures w14:val="none"/>
+          <w:lang w:val="en-GB" w:eastAsia="nb-NO"/>
         </w:rPr>
         <w:t>put</w:t>
       </w:r>
       <w:r>
         <w:rPr>
-          <w:rFonts w:ascii="Times New Roman" w:eastAsiaTheme="majorEastAsia" w:hAnsi="Times New Roman" w:cs="Times New Roman"/>
-          <w:kern w:val="0"/>
-          <w:sz w:val="28"/>
-          <w:szCs w:val="28"/>
-          <w:lang w:val="en-GB" w:eastAsia="nb-NO"/>
-          <w14:ligatures w14:val="none"/>
+          <w:rFonts w:ascii="Times New Roman" w:hAnsi="Times New Roman" w:cs="Times New Roman"/>
+          <w:lang w:val="en-GB" w:eastAsia="nb-NO"/>
         </w:rPr>
         <w:t xml:space="preserve"> and </w:t>
       </w:r>
       <w:r>
         <w:rPr>
-          <w:rFonts w:ascii="Times New Roman" w:eastAsiaTheme="majorEastAsia" w:hAnsi="Times New Roman" w:cs="Times New Roman"/>
+          <w:rFonts w:ascii="Times New Roman" w:hAnsi="Times New Roman" w:cs="Times New Roman"/>
           <w:i/>
           <w:iCs/>
-          <w:kern w:val="0"/>
-          <w:sz w:val="28"/>
-          <w:szCs w:val="28"/>
-          <w:lang w:val="en-GB" w:eastAsia="nb-NO"/>
-          <w14:ligatures w14:val="none"/>
+          <w:lang w:val="en-GB" w:eastAsia="nb-NO"/>
         </w:rPr>
         <w:t>remove</w:t>
       </w:r>
       <w:r>
         <w:rPr>
-          <w:rFonts w:ascii="Times New Roman" w:eastAsiaTheme="majorEastAsia" w:hAnsi="Times New Roman" w:cs="Times New Roman"/>
-          <w:kern w:val="0"/>
-          <w:sz w:val="28"/>
-          <w:szCs w:val="28"/>
-          <w:lang w:val="en-GB" w:eastAsia="nb-NO"/>
-          <w14:ligatures w14:val="none"/>
+          <w:rFonts w:ascii="Times New Roman" w:hAnsi="Times New Roman" w:cs="Times New Roman"/>
+          <w:lang w:val="en-GB" w:eastAsia="nb-NO"/>
         </w:rPr>
         <w:t xml:space="preserve"> which are both synchronized.</w:t>
+      </w:r>
+      <w:r>
+        <w:rPr>
+          <w:rFonts w:ascii="Times New Roman" w:hAnsi="Times New Roman" w:cs="Times New Roman"/>
+        </w:rPr>
+        <w:t xml:space="preserve"> </w:t>
+      </w:r>
+      <w:r>
+        <w:rPr>
+          <w:rFonts w:ascii="Times New Roman" w:hAnsi="Times New Roman" w:cs="Times New Roman"/>
+          <w:lang w:val="en-GB" w:eastAsia="nb-NO"/>
+        </w:rPr>
+        <w:t>This provides intrinsic locks (monitor locks) for mutual exclusion between the Producer and Consumer threads.</w:t>
       </w:r>
     </w:p>
     <w:p>
@@ -1305,6 +1294,153 @@
     </w:p>
     <w:p>
       <w:pPr>
+        <w:pStyle w:val="Listeavsnitt"/>
+        <w:numPr>
+          <w:ilvl w:val="1"/>
+          <w:numId w:val="14"/>
+        </w:numPr>
+        <w:rPr>
+          <w:rFonts w:ascii="Times New Roman" w:hAnsi="Times New Roman" w:cs="Times New Roman"/>
+          <w:lang w:val="en-GB" w:eastAsia="nb-NO"/>
+        </w:rPr>
+      </w:pPr>
+      <w:r>
+        <w:rPr>
+          <w:rFonts w:ascii="Times New Roman" w:hAnsi="Times New Roman" w:cs="Times New Roman"/>
+          <w:lang w:val="en-GB" w:eastAsia="nb-NO"/>
+        </w:rPr>
+        <w:t xml:space="preserve">Without synchronization, these threads access shared mutable state (storage) concurrently without any coordination, resulting in unpredictable </w:t>
+      </w:r>
+      <w:proofErr w:type="spellStart"/>
+      <w:r>
+        <w:rPr>
+          <w:rFonts w:ascii="Times New Roman" w:hAnsi="Times New Roman" w:cs="Times New Roman"/>
+          <w:lang w:val="en-GB" w:eastAsia="nb-NO"/>
+        </w:rPr>
+        <w:t>behavior</w:t>
+      </w:r>
+      <w:proofErr w:type="spellEnd"/>
+      <w:r>
+        <w:rPr>
+          <w:rFonts w:ascii="Times New Roman" w:hAnsi="Times New Roman" w:cs="Times New Roman"/>
+          <w:lang w:val="en-GB" w:eastAsia="nb-NO"/>
+        </w:rPr>
+        <w:t xml:space="preserve"> and potential program crashes.</w:t>
+      </w:r>
+    </w:p>
+    <w:p>
+      <w:pPr>
+        <w:pStyle w:val="Listeavsnitt"/>
+        <w:numPr>
+          <w:ilvl w:val="1"/>
+          <w:numId w:val="14"/>
+        </w:numPr>
+        <w:rPr>
+          <w:rFonts w:ascii="Times New Roman" w:hAnsi="Times New Roman" w:cs="Times New Roman"/>
+          <w:lang w:val="en-GB" w:eastAsia="nb-NO"/>
+        </w:rPr>
+      </w:pPr>
+      <w:r>
+        <w:rPr>
+          <w:rFonts w:ascii="Times New Roman" w:hAnsi="Times New Roman" w:cs="Times New Roman"/>
+          <w:lang w:val="en-GB" w:eastAsia="nb-NO"/>
+        </w:rPr>
+        <w:t>LinkedList corruption: When Producer and Consumer threads call add() and poll() at the same time, they can corrupt the internal linked structure (pointers, head, tail) and potentially causing lost elements.</w:t>
+      </w:r>
+    </w:p>
+    <w:p>
+      <w:pPr>
+        <w:pStyle w:val="Listeavsnitt"/>
+        <w:numPr>
+          <w:ilvl w:val="1"/>
+          <w:numId w:val="14"/>
+        </w:numPr>
+        <w:rPr>
+          <w:lang w:val="en-GB" w:eastAsia="nb-NO"/>
+        </w:rPr>
+      </w:pPr>
+      <w:proofErr w:type="spellStart"/>
+      <w:r>
+        <w:rPr>
+          <w:rFonts w:ascii="Times New Roman" w:hAnsi="Times New Roman" w:cs="Times New Roman"/>
+          <w:lang w:val="en-GB" w:eastAsia="nb-NO"/>
+        </w:rPr>
+        <w:t>NullPointerException</w:t>
+      </w:r>
+      <w:proofErr w:type="spellEnd"/>
+      <w:r>
+        <w:rPr>
+          <w:rFonts w:ascii="Times New Roman" w:hAnsi="Times New Roman" w:cs="Times New Roman"/>
+          <w:lang w:val="en-GB" w:eastAsia="nb-NO"/>
+        </w:rPr>
+        <w:t>: When the queue is empty and Consumer calls</w:t>
+      </w:r>
+      <w:r>
+        <w:rPr>
+          <w:rFonts w:ascii="Times New Roman" w:hAnsi="Times New Roman" w:cs="Times New Roman"/>
+          <w:lang w:val="en-GB" w:eastAsia="nb-NO"/>
+        </w:rPr>
+        <w:t xml:space="preserve"> </w:t>
+      </w:r>
+      <w:proofErr w:type="spellStart"/>
+      <w:r>
+        <w:rPr>
+          <w:rFonts w:ascii="Times New Roman" w:hAnsi="Times New Roman" w:cs="Times New Roman"/>
+          <w:i/>
+          <w:iCs/>
+          <w:lang w:val="en-GB" w:eastAsia="nb-NO"/>
+        </w:rPr>
+        <w:t>storage.poll</w:t>
+      </w:r>
+      <w:proofErr w:type="spellEnd"/>
+      <w:r>
+        <w:rPr>
+          <w:rFonts w:ascii="Times New Roman" w:hAnsi="Times New Roman" w:cs="Times New Roman"/>
+          <w:i/>
+          <w:iCs/>
+          <w:lang w:val="en-GB" w:eastAsia="nb-NO"/>
+        </w:rPr>
+        <w:t>().</w:t>
+      </w:r>
+      <w:proofErr w:type="spellStart"/>
+      <w:r>
+        <w:rPr>
+          <w:rFonts w:ascii="Times New Roman" w:hAnsi="Times New Roman" w:cs="Times New Roman"/>
+          <w:i/>
+          <w:iCs/>
+          <w:lang w:val="en-GB" w:eastAsia="nb-NO"/>
+        </w:rPr>
+        <w:t>toString</w:t>
+      </w:r>
+      <w:proofErr w:type="spellEnd"/>
+      <w:r>
+        <w:rPr>
+          <w:rFonts w:ascii="Times New Roman" w:hAnsi="Times New Roman" w:cs="Times New Roman"/>
+          <w:i/>
+          <w:iCs/>
+          <w:lang w:val="en-GB" w:eastAsia="nb-NO"/>
+        </w:rPr>
+        <w:t>()</w:t>
+      </w:r>
+      <w:r>
+        <w:rPr>
+          <w:rFonts w:ascii="Times New Roman" w:hAnsi="Times New Roman" w:cs="Times New Roman"/>
+          <w:i/>
+          <w:iCs/>
+          <w:lang w:val="en-GB" w:eastAsia="nb-NO"/>
+        </w:rPr>
+        <w:t>, poll()</w:t>
+      </w:r>
+      <w:r>
+        <w:rPr>
+          <w:rFonts w:ascii="Times New Roman" w:hAnsi="Times New Roman" w:cs="Times New Roman"/>
+          <w:lang w:val="en-GB" w:eastAsia="nb-NO"/>
+        </w:rPr>
+        <w:t xml:space="preserve"> returns null, causing the exception.</w:t>
+      </w:r>
+    </w:p>
+    <w:p>
+      <w:pPr>
         <w:keepNext/>
         <w:keepLines/>
         <w:spacing w:before="360" w:after="120" w:line="360" w:lineRule="auto"/>
@@ -1332,8 +1468,37 @@
           <w:lang w:val="en-GB" w:eastAsia="nb-NO"/>
           <w14:ligatures w14:val="none"/>
         </w:rPr>
+        <w:lastRenderedPageBreak/>
         <w:t>Exercise 3:</w:t>
       </w:r>
+      <w:r>
+        <w:rPr>
+          <w:rFonts w:ascii="Times New Roman" w:eastAsiaTheme="majorEastAsia" w:hAnsi="Times New Roman" w:cs="Times New Roman"/>
+          <w:b/>
+          <w:bCs/>
+          <w:kern w:val="0"/>
+          <w:sz w:val="36"/>
+          <w:szCs w:val="36"/>
+          <w:lang w:val="en-GB" w:eastAsia="nb-NO"/>
+          <w14:ligatures w14:val="none"/>
+        </w:rPr>
+        <w:t xml:space="preserve"> </w:t>
+      </w:r>
+      <w:proofErr w:type="spellStart"/>
+      <w:r>
+        <w:rPr>
+          <w:rFonts w:ascii="Times New Roman" w:eastAsiaTheme="majorEastAsia" w:hAnsi="Times New Roman" w:cs="Times New Roman"/>
+          <w:b/>
+          <w:bCs/>
+          <w:kern w:val="0"/>
+          <w:sz w:val="36"/>
+          <w:szCs w:val="36"/>
+          <w:lang w:eastAsia="nb-NO"/>
+          <w14:ligatures w14:val="none"/>
+        </w:rPr>
+        <w:t>raceCondition</w:t>
+      </w:r>
+      <w:proofErr w:type="spellEnd"/>
     </w:p>
     <w:p>
       <w:pPr>
@@ -1374,7 +1539,7 @@
         <w:keepNext/>
         <w:keepLines/>
         <w:numPr>
-          <w:ilvl w:val="0"/>
+          <w:ilvl w:val="1"/>
           <w:numId w:val="14"/>
         </w:numPr>
         <w:spacing w:before="360" w:after="120" w:line="360" w:lineRule="auto"/>
@@ -1383,22 +1548,175 @@
         <w:rPr>
           <w:rFonts w:ascii="Times New Roman" w:eastAsiaTheme="majorEastAsia" w:hAnsi="Times New Roman" w:cs="Times New Roman"/>
           <w:kern w:val="0"/>
-          <w:sz w:val="28"/>
-          <w:szCs w:val="28"/>
-          <w:lang w:val="en-GB" w:eastAsia="nb-NO"/>
-          <w14:ligatures w14:val="none"/>
-        </w:rPr>
-      </w:pPr>
-      <w:r>
-        <w:rPr>
-          <w:rFonts w:ascii="Times New Roman" w:eastAsiaTheme="majorEastAsia" w:hAnsi="Times New Roman" w:cs="Times New Roman"/>
-          <w:kern w:val="0"/>
-          <w:sz w:val="28"/>
-          <w:szCs w:val="28"/>
-          <w:lang w:val="en-GB" w:eastAsia="nb-NO"/>
-          <w14:ligatures w14:val="none"/>
-        </w:rPr>
-        <w:t>Subtask 2: Where are the critical sections</w:t>
+          <w:lang w:val="en-GB" w:eastAsia="nb-NO"/>
+          <w14:ligatures w14:val="none"/>
+        </w:rPr>
+      </w:pPr>
+      <w:r>
+        <w:rPr>
+          <w:rFonts w:ascii="Times New Roman" w:eastAsiaTheme="majorEastAsia" w:hAnsi="Times New Roman" w:cs="Times New Roman"/>
+          <w:kern w:val="0"/>
+          <w:u w:val="single"/>
+          <w:lang w:val="en-GB" w:eastAsia="nb-NO"/>
+          <w14:ligatures w14:val="none"/>
+        </w:rPr>
+        <w:t xml:space="preserve">In </w:t>
+      </w:r>
+      <w:r>
+        <w:rPr>
+          <w:rFonts w:ascii="Times New Roman" w:eastAsiaTheme="majorEastAsia" w:hAnsi="Times New Roman" w:cs="Times New Roman"/>
+          <w:kern w:val="0"/>
+          <w:u w:val="single"/>
+          <w:lang w:val="en-GB" w:eastAsia="nb-NO"/>
+          <w14:ligatures w14:val="none"/>
+        </w:rPr>
+        <w:t>general</w:t>
+      </w:r>
+      <w:r>
+        <w:rPr>
+          <w:rFonts w:ascii="Times New Roman" w:eastAsiaTheme="majorEastAsia" w:hAnsi="Times New Roman" w:cs="Times New Roman"/>
+          <w:kern w:val="0"/>
+          <w:lang w:val="en-GB" w:eastAsia="nb-NO"/>
+          <w14:ligatures w14:val="none"/>
+        </w:rPr>
+        <w:t xml:space="preserve">, </w:t>
+      </w:r>
+      <w:r>
+        <w:rPr>
+          <w:rFonts w:ascii="Times New Roman" w:eastAsiaTheme="majorEastAsia" w:hAnsi="Times New Roman" w:cs="Times New Roman"/>
+          <w:kern w:val="0"/>
+          <w:lang w:val="en-GB" w:eastAsia="nb-NO"/>
+          <w14:ligatures w14:val="none"/>
+        </w:rPr>
+        <w:t xml:space="preserve">Data races occur when multiple threads access shared memory concurrently without proper synchronization, and at least one access is a write operation. Since most operations are non-atomic at the CPU level (e.g., count++ involves read-modify-write steps), threads can interleave their instructions unpredictably, leading to lost updates, inconsistent reads, and visibility issues due to CPU caching. Without synchronization mechanisms like locks or atomic operations, the program </w:t>
+      </w:r>
+      <w:r>
+        <w:rPr>
+          <w:rFonts w:ascii="Times New Roman" w:eastAsiaTheme="majorEastAsia" w:hAnsi="Times New Roman" w:cs="Times New Roman"/>
+          <w:kern w:val="0"/>
+          <w:lang w:val="en-GB" w:eastAsia="nb-NO"/>
+          <w14:ligatures w14:val="none"/>
+        </w:rPr>
+        <w:t>behaviour</w:t>
+      </w:r>
+      <w:r>
+        <w:rPr>
+          <w:rFonts w:ascii="Times New Roman" w:eastAsiaTheme="majorEastAsia" w:hAnsi="Times New Roman" w:cs="Times New Roman"/>
+          <w:kern w:val="0"/>
+          <w:lang w:val="en-GB" w:eastAsia="nb-NO"/>
+          <w14:ligatures w14:val="none"/>
+        </w:rPr>
+        <w:t xml:space="preserve"> becomes non-deterministic—the outcome depends on thread scheduling timing, making the same code produce different results on different runs.</w:t>
+      </w:r>
+    </w:p>
+    <w:p>
+      <w:pPr>
+        <w:pStyle w:val="Listeavsnitt"/>
+        <w:keepNext/>
+        <w:keepLines/>
+        <w:numPr>
+          <w:ilvl w:val="1"/>
+          <w:numId w:val="14"/>
+        </w:numPr>
+        <w:spacing w:before="360" w:after="120" w:line="360" w:lineRule="auto"/>
+        <w:ind w:right="360"/>
+        <w:outlineLvl w:val="0"/>
+        <w:rPr>
+          <w:rFonts w:ascii="Times New Roman" w:eastAsiaTheme="majorEastAsia" w:hAnsi="Times New Roman" w:cs="Times New Roman"/>
+          <w:kern w:val="0"/>
+          <w:lang w:val="en-GB" w:eastAsia="nb-NO"/>
+          <w14:ligatures w14:val="none"/>
+        </w:rPr>
+      </w:pPr>
+      <w:r>
+        <w:rPr>
+          <w:rFonts w:ascii="Times New Roman" w:eastAsiaTheme="majorEastAsia" w:hAnsi="Times New Roman" w:cs="Times New Roman"/>
+          <w:kern w:val="0"/>
+          <w:u w:val="single"/>
+          <w:lang w:val="en-GB" w:eastAsia="nb-NO"/>
+          <w14:ligatures w14:val="none"/>
+        </w:rPr>
+        <w:t>In this case</w:t>
+      </w:r>
+      <w:r>
+        <w:rPr>
+          <w:rFonts w:ascii="Times New Roman" w:eastAsiaTheme="majorEastAsia" w:hAnsi="Times New Roman" w:cs="Times New Roman"/>
+          <w:kern w:val="0"/>
+          <w:lang w:val="en-GB" w:eastAsia="nb-NO"/>
+          <w14:ligatures w14:val="none"/>
+        </w:rPr>
+        <w:t>, t</w:t>
+      </w:r>
+      <w:r>
+        <w:rPr>
+          <w:rFonts w:ascii="Times New Roman" w:eastAsiaTheme="majorEastAsia" w:hAnsi="Times New Roman" w:cs="Times New Roman"/>
+          <w:kern w:val="0"/>
+          <w:lang w:val="en-GB" w:eastAsia="nb-NO"/>
+          <w14:ligatures w14:val="none"/>
+        </w:rPr>
+        <w:t xml:space="preserve">he code currently prevents data races by using a </w:t>
+      </w:r>
+      <w:proofErr w:type="spellStart"/>
+      <w:r>
+        <w:rPr>
+          <w:rFonts w:ascii="Times New Roman" w:eastAsiaTheme="majorEastAsia" w:hAnsi="Times New Roman" w:cs="Times New Roman"/>
+          <w:i/>
+          <w:iCs/>
+          <w:kern w:val="0"/>
+          <w:lang w:val="en-GB" w:eastAsia="nb-NO"/>
+          <w14:ligatures w14:val="none"/>
+        </w:rPr>
+        <w:t>ReentrantLock</w:t>
+      </w:r>
+      <w:proofErr w:type="spellEnd"/>
+      <w:r>
+        <w:rPr>
+          <w:rFonts w:ascii="Times New Roman" w:eastAsiaTheme="majorEastAsia" w:hAnsi="Times New Roman" w:cs="Times New Roman"/>
+          <w:kern w:val="0"/>
+          <w:lang w:val="en-GB" w:eastAsia="nb-NO"/>
+          <w14:ligatures w14:val="none"/>
+        </w:rPr>
+        <w:t xml:space="preserve"> in DataRace.java.</w:t>
+      </w:r>
+      <w:r>
+        <w:rPr>
+          <w:rFonts w:ascii="Times New Roman" w:eastAsiaTheme="majorEastAsia" w:hAnsi="Times New Roman" w:cs="Times New Roman"/>
+          <w:kern w:val="0"/>
+          <w:lang w:val="en-GB" w:eastAsia="nb-NO"/>
+          <w14:ligatures w14:val="none"/>
+        </w:rPr>
+        <w:t xml:space="preserve"> </w:t>
+      </w:r>
+      <w:r>
+        <w:rPr>
+          <w:rFonts w:ascii="Times New Roman" w:eastAsiaTheme="majorEastAsia" w:hAnsi="Times New Roman" w:cs="Times New Roman"/>
+          <w:kern w:val="0"/>
+          <w:lang w:val="en-GB" w:eastAsia="nb-NO"/>
+          <w14:ligatures w14:val="none"/>
+        </w:rPr>
+        <w:t xml:space="preserve">The </w:t>
+      </w:r>
+      <w:proofErr w:type="spellStart"/>
+      <w:r>
+        <w:rPr>
+          <w:rFonts w:ascii="Times New Roman" w:eastAsiaTheme="majorEastAsia" w:hAnsi="Times New Roman" w:cs="Times New Roman"/>
+          <w:i/>
+          <w:iCs/>
+          <w:kern w:val="0"/>
+          <w:lang w:val="en-GB" w:eastAsia="nb-NO"/>
+          <w14:ligatures w14:val="none"/>
+        </w:rPr>
+        <w:t>ReentrantLock</w:t>
+      </w:r>
+      <w:proofErr w:type="spellEnd"/>
+      <w:r>
+        <w:rPr>
+          <w:rFonts w:ascii="Times New Roman" w:eastAsiaTheme="majorEastAsia" w:hAnsi="Times New Roman" w:cs="Times New Roman"/>
+          <w:kern w:val="0"/>
+          <w:lang w:val="en-GB" w:eastAsia="nb-NO"/>
+          <w14:ligatures w14:val="none"/>
+        </w:rPr>
+        <w:t xml:space="preserve"> ensures that only one thread can execute the entire read-modify-write sequence at a time, making the operations atomic and preventing the race condition.</w:t>
       </w:r>
     </w:p>
     <w:p>
@@ -1431,16 +1749,329 @@
           <w:lang w:val="en-GB" w:eastAsia="nb-NO"/>
           <w14:ligatures w14:val="none"/>
         </w:rPr>
-        <w:t>Subtask 3:</w:t>
-      </w:r>
-      <w:r>
-        <w:rPr>
-          <w:rFonts w:ascii="Times New Roman" w:hAnsi="Times New Roman" w:cs="Times New Roman"/>
+        <w:t>Subtask 2: Where are the critical sections</w:t>
+      </w:r>
+    </w:p>
+    <w:p>
+      <w:pPr>
+        <w:pStyle w:val="Listeavsnitt"/>
+        <w:numPr>
+          <w:ilvl w:val="1"/>
+          <w:numId w:val="14"/>
+        </w:numPr>
+        <w:rPr>
+          <w:rFonts w:ascii="Times New Roman" w:hAnsi="Times New Roman" w:cs="Times New Roman"/>
+          <w:lang w:val="en-GB" w:eastAsia="nb-NO"/>
+        </w:rPr>
+      </w:pPr>
+      <w:proofErr w:type="spellStart"/>
+      <w:r>
+        <w:rPr>
+          <w:rFonts w:ascii="Times New Roman" w:hAnsi="Times New Roman" w:cs="Times New Roman"/>
+          <w:u w:val="single"/>
+          <w:lang w:val="en-GB" w:eastAsia="nb-NO"/>
+        </w:rPr>
+        <w:t>DataRace</w:t>
+      </w:r>
+      <w:proofErr w:type="spellEnd"/>
+      <w:r>
+        <w:rPr>
+          <w:rFonts w:ascii="Times New Roman" w:hAnsi="Times New Roman" w:cs="Times New Roman"/>
+          <w:lang w:val="en-GB" w:eastAsia="nb-NO"/>
+        </w:rPr>
+        <w:t>:</w:t>
+      </w:r>
+      <w:r>
+        <w:rPr>
+          <w:rFonts w:ascii="Times New Roman" w:hAnsi="Times New Roman" w:cs="Times New Roman"/>
+          <w:lang w:val="en-GB" w:eastAsia="nb-NO"/>
+        </w:rPr>
+        <w:t xml:space="preserve"> The methods </w:t>
+      </w:r>
+      <w:r>
+        <w:rPr>
+          <w:rFonts w:ascii="Times New Roman" w:hAnsi="Times New Roman" w:cs="Times New Roman"/>
+          <w:i/>
+          <w:iCs/>
+          <w:lang w:val="en-GB" w:eastAsia="nb-NO"/>
+        </w:rPr>
+        <w:t>increment</w:t>
+      </w:r>
+      <w:r>
+        <w:rPr>
+          <w:rFonts w:ascii="Times New Roman" w:hAnsi="Times New Roman" w:cs="Times New Roman"/>
+          <w:lang w:val="en-GB" w:eastAsia="nb-NO"/>
+        </w:rPr>
+        <w:t xml:space="preserve"> and </w:t>
+      </w:r>
+      <w:r>
+        <w:rPr>
+          <w:rFonts w:ascii="Times New Roman" w:hAnsi="Times New Roman" w:cs="Times New Roman"/>
+          <w:i/>
+          <w:iCs/>
+          <w:lang w:val="en-GB" w:eastAsia="nb-NO"/>
+        </w:rPr>
+        <w:t>decrement</w:t>
+      </w:r>
+      <w:r>
+        <w:rPr>
+          <w:rFonts w:ascii="Times New Roman" w:hAnsi="Times New Roman" w:cs="Times New Roman"/>
+          <w:lang w:val="en-GB" w:eastAsia="nb-NO"/>
+        </w:rPr>
+        <w:t xml:space="preserve"> are critical sections in this class.</w:t>
+      </w:r>
+      <w:r>
+        <w:rPr>
+          <w:rFonts w:ascii="Times New Roman" w:hAnsi="Times New Roman" w:cs="Times New Roman"/>
+        </w:rPr>
+        <w:t xml:space="preserve"> </w:t>
+      </w:r>
+      <w:r>
+        <w:rPr>
+          <w:rFonts w:ascii="Times New Roman" w:hAnsi="Times New Roman" w:cs="Times New Roman"/>
+          <w:lang w:val="en-GB" w:eastAsia="nb-NO"/>
+        </w:rPr>
+        <w:t xml:space="preserve">Both critical sections are protected by the </w:t>
+      </w:r>
+      <w:proofErr w:type="spellStart"/>
+      <w:r>
+        <w:rPr>
+          <w:rFonts w:ascii="Times New Roman" w:hAnsi="Times New Roman" w:cs="Times New Roman"/>
+          <w:lang w:val="en-GB" w:eastAsia="nb-NO"/>
+        </w:rPr>
+        <w:t>ReentrantLock</w:t>
+      </w:r>
+      <w:proofErr w:type="spellEnd"/>
+      <w:r>
+        <w:rPr>
+          <w:rFonts w:ascii="Times New Roman" w:hAnsi="Times New Roman" w:cs="Times New Roman"/>
+          <w:lang w:val="en-GB" w:eastAsia="nb-NO"/>
+        </w:rPr>
+        <w:t xml:space="preserve">, ensuring only one thread can execute either operation at a time. The </w:t>
+      </w:r>
+      <w:proofErr w:type="spellStart"/>
+      <w:r>
+        <w:rPr>
+          <w:rFonts w:ascii="Times New Roman" w:hAnsi="Times New Roman" w:cs="Times New Roman"/>
+          <w:lang w:val="en-GB" w:eastAsia="nb-NO"/>
+        </w:rPr>
+        <w:t>lock.lock</w:t>
+      </w:r>
+      <w:proofErr w:type="spellEnd"/>
+      <w:r>
+        <w:rPr>
+          <w:rFonts w:ascii="Times New Roman" w:hAnsi="Times New Roman" w:cs="Times New Roman"/>
+          <w:lang w:val="en-GB" w:eastAsia="nb-NO"/>
+        </w:rPr>
+        <w:t xml:space="preserve">() and </w:t>
+      </w:r>
+      <w:proofErr w:type="spellStart"/>
+      <w:r>
+        <w:rPr>
+          <w:rFonts w:ascii="Times New Roman" w:hAnsi="Times New Roman" w:cs="Times New Roman"/>
+          <w:lang w:val="en-GB" w:eastAsia="nb-NO"/>
+        </w:rPr>
+        <w:t>lock.unlock</w:t>
+      </w:r>
+      <w:proofErr w:type="spellEnd"/>
+      <w:r>
+        <w:rPr>
+          <w:rFonts w:ascii="Times New Roman" w:hAnsi="Times New Roman" w:cs="Times New Roman"/>
+          <w:lang w:val="en-GB" w:eastAsia="nb-NO"/>
+        </w:rPr>
+        <w:t>() calls define the boundaries of these critical sections.</w:t>
+      </w:r>
+    </w:p>
+    <w:p>
+      <w:pPr>
+        <w:pStyle w:val="Listeavsnitt"/>
+        <w:numPr>
+          <w:ilvl w:val="1"/>
+          <w:numId w:val="14"/>
+        </w:numPr>
+        <w:rPr>
+          <w:rFonts w:ascii="Times New Roman" w:hAnsi="Times New Roman" w:cs="Times New Roman"/>
+          <w:lang w:val="en-GB" w:eastAsia="nb-NO"/>
+        </w:rPr>
+      </w:pPr>
+      <w:proofErr w:type="spellStart"/>
+      <w:r>
+        <w:rPr>
+          <w:rFonts w:ascii="Times New Roman" w:hAnsi="Times New Roman" w:cs="Times New Roman"/>
+          <w:u w:val="single"/>
+          <w:lang w:val="en-GB" w:eastAsia="nb-NO"/>
+        </w:rPr>
+        <w:t>DecreaseTask</w:t>
+      </w:r>
+      <w:proofErr w:type="spellEnd"/>
+      <w:r>
+        <w:rPr>
+          <w:rFonts w:ascii="Times New Roman" w:hAnsi="Times New Roman" w:cs="Times New Roman"/>
+          <w:lang w:val="en-GB" w:eastAsia="nb-NO"/>
+        </w:rPr>
+        <w:t xml:space="preserve">: The call to </w:t>
+      </w:r>
+      <w:proofErr w:type="spellStart"/>
+      <w:r>
+        <w:rPr>
+          <w:rFonts w:ascii="Times New Roman" w:hAnsi="Times New Roman" w:cs="Times New Roman"/>
+          <w:lang w:val="en-GB" w:eastAsia="nb-NO"/>
+        </w:rPr>
+        <w:t>Counter.decrement</w:t>
+      </w:r>
+      <w:proofErr w:type="spellEnd"/>
+      <w:r>
+        <w:rPr>
+          <w:rFonts w:ascii="Times New Roman" w:hAnsi="Times New Roman" w:cs="Times New Roman"/>
+          <w:lang w:val="en-GB" w:eastAsia="nb-NO"/>
+        </w:rPr>
+        <w:t xml:space="preserve">() in the loop is the critical section where the thread accesses the shared </w:t>
+      </w:r>
+      <w:proofErr w:type="spellStart"/>
+      <w:r>
+        <w:rPr>
+          <w:rFonts w:ascii="Times New Roman" w:hAnsi="Times New Roman" w:cs="Times New Roman"/>
+          <w:lang w:val="en-GB" w:eastAsia="nb-NO"/>
+        </w:rPr>
+        <w:t>DataRace</w:t>
+      </w:r>
+      <w:proofErr w:type="spellEnd"/>
+      <w:r>
+        <w:rPr>
+          <w:rFonts w:ascii="Times New Roman" w:hAnsi="Times New Roman" w:cs="Times New Roman"/>
+          <w:lang w:val="en-GB" w:eastAsia="nb-NO"/>
+        </w:rPr>
+        <w:t xml:space="preserve"> object. The synchronization is delegated to the </w:t>
+      </w:r>
+      <w:proofErr w:type="spellStart"/>
+      <w:r>
+        <w:rPr>
+          <w:rFonts w:ascii="Times New Roman" w:hAnsi="Times New Roman" w:cs="Times New Roman"/>
+          <w:lang w:val="en-GB" w:eastAsia="nb-NO"/>
+        </w:rPr>
+        <w:t>DataRace</w:t>
+      </w:r>
+      <w:proofErr w:type="spellEnd"/>
+      <w:r>
+        <w:rPr>
+          <w:rFonts w:ascii="Times New Roman" w:hAnsi="Times New Roman" w:cs="Times New Roman"/>
+          <w:lang w:val="en-GB" w:eastAsia="nb-NO"/>
+        </w:rPr>
+        <w:t xml:space="preserve"> class, where the </w:t>
+      </w:r>
+      <w:proofErr w:type="spellStart"/>
+      <w:r>
+        <w:rPr>
+          <w:rFonts w:ascii="Times New Roman" w:hAnsi="Times New Roman" w:cs="Times New Roman"/>
+          <w:lang w:val="en-GB" w:eastAsia="nb-NO"/>
+        </w:rPr>
+        <w:t>ReentrantLock</w:t>
+      </w:r>
+      <w:proofErr w:type="spellEnd"/>
+      <w:r>
+        <w:rPr>
+          <w:rFonts w:ascii="Times New Roman" w:hAnsi="Times New Roman" w:cs="Times New Roman"/>
+          <w:lang w:val="en-GB" w:eastAsia="nb-NO"/>
+        </w:rPr>
+        <w:t xml:space="preserve"> protects the actual modification of the count variable.</w:t>
+      </w:r>
+    </w:p>
+    <w:p>
+      <w:pPr>
+        <w:pStyle w:val="Listeavsnitt"/>
+        <w:numPr>
+          <w:ilvl w:val="1"/>
+          <w:numId w:val="14"/>
+        </w:numPr>
+        <w:rPr>
+          <w:rFonts w:ascii="Times New Roman" w:eastAsiaTheme="majorEastAsia" w:hAnsi="Times New Roman" w:cs="Times New Roman"/>
+          <w:kern w:val="0"/>
           <w:sz w:val="28"/>
           <w:szCs w:val="28"/>
-          <w:lang w:val="en-GB"/>
-        </w:rPr>
-        <w:t xml:space="preserve"> Fix the data inconsistency problem using Monitor</w:t>
+          <w:lang w:val="en-GB" w:eastAsia="nb-NO"/>
+          <w14:ligatures w14:val="none"/>
+        </w:rPr>
+      </w:pPr>
+      <w:proofErr w:type="spellStart"/>
+      <w:r>
+        <w:rPr>
+          <w:rFonts w:ascii="Times New Roman" w:hAnsi="Times New Roman" w:cs="Times New Roman"/>
+          <w:u w:val="single"/>
+          <w:lang w:val="en-GB" w:eastAsia="nb-NO"/>
+        </w:rPr>
+        <w:t>IncreaseTask</w:t>
+      </w:r>
+      <w:proofErr w:type="spellEnd"/>
+      <w:r>
+        <w:rPr>
+          <w:rFonts w:ascii="Times New Roman" w:hAnsi="Times New Roman" w:cs="Times New Roman"/>
+          <w:lang w:val="en-GB" w:eastAsia="nb-NO"/>
+        </w:rPr>
+        <w:t xml:space="preserve">: The call to </w:t>
+      </w:r>
+      <w:proofErr w:type="spellStart"/>
+      <w:r>
+        <w:rPr>
+          <w:rFonts w:ascii="Times New Roman" w:hAnsi="Times New Roman" w:cs="Times New Roman"/>
+          <w:lang w:val="en-GB" w:eastAsia="nb-NO"/>
+        </w:rPr>
+        <w:t>counter.increment</w:t>
+      </w:r>
+      <w:proofErr w:type="spellEnd"/>
+      <w:r>
+        <w:rPr>
+          <w:rFonts w:ascii="Times New Roman" w:hAnsi="Times New Roman" w:cs="Times New Roman"/>
+          <w:lang w:val="en-GB" w:eastAsia="nb-NO"/>
+        </w:rPr>
+        <w:t xml:space="preserve">() in the loop is the critical section where the thread accesses the shared </w:t>
+      </w:r>
+      <w:proofErr w:type="spellStart"/>
+      <w:r>
+        <w:rPr>
+          <w:rFonts w:ascii="Times New Roman" w:hAnsi="Times New Roman" w:cs="Times New Roman"/>
+          <w:lang w:val="en-GB" w:eastAsia="nb-NO"/>
+        </w:rPr>
+        <w:t>DataRace</w:t>
+      </w:r>
+      <w:proofErr w:type="spellEnd"/>
+      <w:r>
+        <w:rPr>
+          <w:rFonts w:ascii="Times New Roman" w:hAnsi="Times New Roman" w:cs="Times New Roman"/>
+          <w:lang w:val="en-GB" w:eastAsia="nb-NO"/>
+        </w:rPr>
+        <w:t xml:space="preserve"> object. The synchronization is delegated to the </w:t>
+      </w:r>
+      <w:proofErr w:type="spellStart"/>
+      <w:r>
+        <w:rPr>
+          <w:rFonts w:ascii="Times New Roman" w:hAnsi="Times New Roman" w:cs="Times New Roman"/>
+          <w:lang w:val="en-GB" w:eastAsia="nb-NO"/>
+        </w:rPr>
+        <w:t>DataRace</w:t>
+      </w:r>
+      <w:proofErr w:type="spellEnd"/>
+      <w:r>
+        <w:rPr>
+          <w:rFonts w:ascii="Times New Roman" w:hAnsi="Times New Roman" w:cs="Times New Roman"/>
+          <w:lang w:val="en-GB" w:eastAsia="nb-NO"/>
+        </w:rPr>
+        <w:t xml:space="preserve"> class, where the </w:t>
+      </w:r>
+      <w:proofErr w:type="spellStart"/>
+      <w:r>
+        <w:rPr>
+          <w:rFonts w:ascii="Times New Roman" w:hAnsi="Times New Roman" w:cs="Times New Roman"/>
+          <w:lang w:val="en-GB" w:eastAsia="nb-NO"/>
+        </w:rPr>
+        <w:t>ReentrantLock</w:t>
+      </w:r>
+      <w:proofErr w:type="spellEnd"/>
+      <w:r>
+        <w:rPr>
+          <w:rFonts w:ascii="Times New Roman" w:hAnsi="Times New Roman" w:cs="Times New Roman"/>
+          <w:lang w:val="en-GB" w:eastAsia="nb-NO"/>
+        </w:rPr>
+        <w:t xml:space="preserve"> protects the actual modification of the count variable.</w:t>
       </w:r>
     </w:p>
     <w:p>
@@ -1466,6 +2097,49 @@
       </w:pPr>
       <w:r>
         <w:rPr>
+          <w:rFonts w:ascii="Times New Roman" w:eastAsiaTheme="majorEastAsia" w:hAnsi="Times New Roman" w:cs="Times New Roman"/>
+          <w:kern w:val="0"/>
+          <w:sz w:val="28"/>
+          <w:szCs w:val="28"/>
+          <w:lang w:val="en-GB" w:eastAsia="nb-NO"/>
+          <w14:ligatures w14:val="none"/>
+        </w:rPr>
+        <w:lastRenderedPageBreak/>
+        <w:t>Subtask 3:</w:t>
+      </w:r>
+      <w:r>
+        <w:rPr>
+          <w:rFonts w:ascii="Times New Roman" w:hAnsi="Times New Roman" w:cs="Times New Roman"/>
+          <w:sz w:val="28"/>
+          <w:szCs w:val="28"/>
+          <w:lang w:val="en-GB"/>
+        </w:rPr>
+        <w:t xml:space="preserve"> Fix the data inconsistency problem using Monitor</w:t>
+      </w:r>
+    </w:p>
+    <w:p>
+      <w:pPr>
+        <w:pStyle w:val="Listeavsnitt"/>
+        <w:keepNext/>
+        <w:keepLines/>
+        <w:numPr>
+          <w:ilvl w:val="0"/>
+          <w:numId w:val="14"/>
+        </w:numPr>
+        <w:spacing w:before="360" w:after="120" w:line="360" w:lineRule="auto"/>
+        <w:ind w:right="360"/>
+        <w:outlineLvl w:val="0"/>
+        <w:rPr>
+          <w:rFonts w:ascii="Times New Roman" w:eastAsiaTheme="majorEastAsia" w:hAnsi="Times New Roman" w:cs="Times New Roman"/>
+          <w:kern w:val="0"/>
+          <w:sz w:val="28"/>
+          <w:szCs w:val="28"/>
+          <w:lang w:val="en-GB" w:eastAsia="nb-NO"/>
+          <w14:ligatures w14:val="none"/>
+        </w:rPr>
+      </w:pPr>
+      <w:r>
+        <w:rPr>
           <w:rFonts w:ascii="Times New Roman" w:hAnsi="Times New Roman" w:cs="Times New Roman"/>
           <w:sz w:val="28"/>
           <w:szCs w:val="28"/>
@@ -1505,6 +2179,34 @@
         </w:rPr>
         <w:t>Exercise 4:</w:t>
       </w:r>
+      <w:r>
+        <w:rPr>
+          <w:rFonts w:ascii="Times New Roman" w:eastAsiaTheme="majorEastAsia" w:hAnsi="Times New Roman" w:cs="Times New Roman"/>
+          <w:b/>
+          <w:bCs/>
+          <w:kern w:val="0"/>
+          <w:sz w:val="36"/>
+          <w:szCs w:val="36"/>
+          <w:lang w:val="en-GB" w:eastAsia="nb-NO"/>
+          <w14:ligatures w14:val="none"/>
+        </w:rPr>
+        <w:t xml:space="preserve"> </w:t>
+      </w:r>
+      <w:proofErr w:type="spellStart"/>
+      <w:r>
+        <w:rPr>
+          <w:rFonts w:ascii="Times New Roman" w:eastAsiaTheme="majorEastAsia" w:hAnsi="Times New Roman" w:cs="Times New Roman"/>
+          <w:b/>
+          <w:bCs/>
+          <w:kern w:val="0"/>
+          <w:sz w:val="36"/>
+          <w:szCs w:val="36"/>
+          <w:lang w:eastAsia="nb-NO"/>
+          <w14:ligatures w14:val="none"/>
+        </w:rPr>
+        <w:t>parking</w:t>
+      </w:r>
+      <w:proofErr w:type="spellEnd"/>
     </w:p>
     <w:p>
       <w:pPr>
@@ -1781,6 +2483,11 @@
         <w:docPartUnique/>
       </w:docPartObj>
     </w:sdtPr>
+    <w:sdtEndPr>
+      <w:rPr>
+        <w:rStyle w:val="Sidetall"/>
+      </w:rPr>
+    </w:sdtEndPr>
     <w:sdtContent>
       <w:p>
         <w:pPr>
@@ -1839,6 +2546,11 @@
         <w:docPartUnique/>
       </w:docPartObj>
     </w:sdtPr>
+    <w:sdtEndPr>
+      <w:rPr>
+        <w:rStyle w:val="Sidetall"/>
+      </w:rPr>
+    </w:sdtEndPr>
     <w:sdtContent>
       <w:p>
         <w:pPr>
@@ -2691,7 +3403,7 @@
   <w:abstractNum w:abstractNumId="7" w15:restartNumberingAfterBreak="0">
     <w:nsid w:val="58A4597A"/>
     <w:multiLevelType w:val="hybridMultilevel"/>
-    <w:tmpl w:val="46F0D5C0"/>
+    <w:tmpl w:val="32CC13C0"/>
     <w:lvl w:ilvl="0" w:tplc="4F68DC04">
       <w:numFmt w:val="bullet"/>
       <w:lvlText w:val="-"/>
@@ -3715,7 +4427,6 @@
   <w:style w:type="character" w:default="1" w:styleId="Standardskriftforavsnitt">
     <w:name w:val="Default Paragraph Font"/>
     <w:uiPriority w:val="1"/>
-    <w:semiHidden/>
     <w:unhideWhenUsed/>
   </w:style>
   <w:style w:type="table" w:default="1" w:styleId="Vanligtabell">
@@ -4057,6 +4768,29 @@
     <w:unhideWhenUsed/>
     <w:rsid w:val="0008191A"/>
   </w:style>
+  <w:style w:type="character" w:styleId="Hyperkobling">
+    <w:name w:val="Hyperlink"/>
+    <w:basedOn w:val="Standardskriftforavsnitt"/>
+    <w:uiPriority w:val="99"/>
+    <w:unhideWhenUsed/>
+    <w:rsid w:val="009408EB"/>
+    <w:rPr>
+      <w:color w:val="467886" w:themeColor="hyperlink"/>
+      <w:u w:val="single"/>
+    </w:rPr>
+  </w:style>
+  <w:style w:type="character" w:styleId="Ulstomtale">
+    <w:name w:val="Unresolved Mention"/>
+    <w:basedOn w:val="Standardskriftforavsnitt"/>
+    <w:uiPriority w:val="99"/>
+    <w:semiHidden/>
+    <w:unhideWhenUsed/>
+    <w:rsid w:val="009408EB"/>
+    <w:rPr>
+      <w:color w:val="605E5C"/>
+      <w:shd w:val="clear" w:color="auto" w:fill="E1DFDD"/>
+    </w:rPr>
+  </w:style>
 </w:styles>
 </file>
 

</xml_diff>